<commit_message>
S163 C: KG pilot QC — fix 17 verify flags + normalize clauses schema (si/section_name)
Resolve all 17 QC_VERIFY_ISSUES flags (fabricated framing / dropped obligations /
bad citation) via _qc_fix.py (exact-match + assert). Also fix a structural S162 bug
found during review: kg_operation/clauses.json used non-canonical section_no/name,
breaking backend supplement linkage (388/388 items unlinked, now restored) and
leaving 學校版 docx chapter names blank. Normalized to si/section_name; regenerated
4 docx + bundle + manifest.
</commit_message>
<xml_diff>
--- a/dev/checklists/kg_operation/本校幼稚園營運政策_學校版_DRAFT.docx
+++ b/dev/checklists/kg_operation/本校幼稚園營運政策_學校版_DRAFT.docx
@@ -179,7 +179,7 @@
           <w:sz w:val="28"/>
           <w:szCs w:val="28"/>
         </w:rPr>
-        <w:t xml:space="preserve">1. </w:t>
+        <w:t xml:space="preserve">1. 校舍選址與樓宇結構</w:t>
       </w:r>
     </w:p>
     <w:p>
@@ -203,7 +203,7 @@
           <w:sz w:val="22"/>
           <w:szCs w:val="22"/>
         </w:rPr>
-        <w:t xml:space="preserve">本校於租賃或購置擬設立校舍的樓宇前，必須確定有關樓宇用地適合作幼稚園用途，且該建築物符合基本的樓宇安全規定。本校亦須確保校舍和所有設備均屬安全，為兒童提供安全的學習環境。如有關幼稚園房產以結構性的木地板建造，當局將拒絕根據《教育條例》第12(1)(b)條發出證明書，故本校於選址時須避免採用結構性木地板的房產。</w:t>
+        <w:t xml:space="preserve">本校於租賃或購置擬設立校舍的樓宇前，必須確定有關樓宇用地適合作幼稚園用途，且該建築物符合基本的樓宇安全規定。本校亦須確保校舍和所有設備均屬安全，為兒童提供安全的學習環境。如有關幼稚園房產以結構性的木地板建造，當局將拒絕根據《教育條例》第12(1)(b)條發出證明書。</w:t>
       </w:r>
       <w:r>
         <w:rPr>
@@ -779,7 +779,7 @@
         </w:rPr>
         <w:t xml:space="preserve">1　</w:t>
       </w:r>
-      <w:hyperlink w:history="1" r:id="rIddyza-ff7h6lbrtthnvvia">
+      <w:hyperlink w:history="1" r:id="rIdycrcgiz2ec9t-qkawlhpe">
         <w:r>
           <w:rPr>
             <w:rStyle w:val="Hyperlink"/>
@@ -805,7 +805,7 @@
         </w:rPr>
         <w:t xml:space="preserve">2　</w:t>
       </w:r>
-      <w:hyperlink w:history="1" r:id="rIdyf8n-onaytgwkxfy0j_zh">
+      <w:hyperlink w:history="1" r:id="rIdz1v0weenmjhsuzq8umr0x">
         <w:r>
           <w:rPr>
             <w:rStyle w:val="Hyperlink"/>
@@ -831,7 +831,7 @@
         </w:rPr>
         <w:t xml:space="preserve">3, 11　</w:t>
       </w:r>
-      <w:hyperlink w:history="1" r:id="rIdrtzjcrftd5rrypf2nso8o">
+      <w:hyperlink w:history="1" r:id="rIdeamv6kbqg-wwhemz6chwv">
         <w:r>
           <w:rPr>
             <w:rStyle w:val="Hyperlink"/>
@@ -857,7 +857,7 @@
         </w:rPr>
         <w:t xml:space="preserve">4, 6　</w:t>
       </w:r>
-      <w:hyperlink w:history="1" r:id="rIdxtoxjj_y-rn0ow0av-paq">
+      <w:hyperlink w:history="1" r:id="rIdwqtskopcxubuthyzci9ol">
         <w:r>
           <w:rPr>
             <w:rStyle w:val="Hyperlink"/>
@@ -883,7 +883,7 @@
         </w:rPr>
         <w:t xml:space="preserve">5, 12　</w:t>
       </w:r>
-      <w:hyperlink w:history="1" r:id="rIdqtyxn5lesehrdbyemjwac">
+      <w:hyperlink w:history="1" r:id="rIdwnfche6xfghyqzv4pfg5p">
         <w:r>
           <w:rPr>
             <w:rStyle w:val="Hyperlink"/>
@@ -909,7 +909,7 @@
         </w:rPr>
         <w:t xml:space="preserve">7　</w:t>
       </w:r>
-      <w:hyperlink w:history="1" r:id="rIdlwq_vhipr4lbgcbtmuaoo">
+      <w:hyperlink w:history="1" r:id="rId5gmltagtpnfouiuxlmaac">
         <w:r>
           <w:rPr>
             <w:rStyle w:val="Hyperlink"/>
@@ -935,7 +935,7 @@
         </w:rPr>
         <w:t xml:space="preserve">8, 10　</w:t>
       </w:r>
-      <w:hyperlink w:history="1" r:id="rId9kfxiaatziateqzjxrc0o">
+      <w:hyperlink w:history="1" r:id="rIdflkkow-ghmjwgmkpvmulp">
         <w:r>
           <w:rPr>
             <w:rStyle w:val="Hyperlink"/>
@@ -961,7 +961,7 @@
         </w:rPr>
         <w:t xml:space="preserve">9, 13　</w:t>
       </w:r>
-      <w:hyperlink w:history="1" r:id="rId4whdqz-yq0lov48wdd01w">
+      <w:hyperlink w:history="1" r:id="rIdz5qolbms8zohg_lzw2io_">
         <w:r>
           <w:rPr>
             <w:rStyle w:val="Hyperlink"/>
@@ -987,7 +987,7 @@
           <w:sz w:val="28"/>
           <w:szCs w:val="28"/>
         </w:rPr>
-        <w:t xml:space="preserve">2. </w:t>
+        <w:t xml:space="preserve">2. 園舍設施與設備</w:t>
       </w:r>
     </w:p>
     <w:p>
@@ -1011,7 +1011,7 @@
           <w:sz w:val="22"/>
           <w:szCs w:val="22"/>
         </w:rPr>
-        <w:t xml:space="preserve">本校洗手間的設計與裝修須符合衞生及安全標準。洗手間必須設有通出露天的窗口，窗口總面積最少為洗手間地面面積的十分之一；牆壁應至少鋪上一米高的瓷磚，地面應鋪砌防滑地磚。本校兒童廁所應與職員廁所分開設置。本校須為每30名男童或每25名女童設1個洗手盆。</w:t>
+        <w:t xml:space="preserve">本校洗手間必須設有通出露天的窗口，窗口總面積最少為洗手間地面面積的十分之一；牆壁應至少鋪上一米高的瓷磚，地面應鋪砌防滑地磚。本校兒童廁所應與職員廁所分開設置。本校須為每30名男童或每25名女童設1個洗手盆。</w:t>
       </w:r>
       <w:r>
         <w:rPr>
@@ -1604,7 +1604,7 @@
         </w:rPr>
         <w:t xml:space="preserve">1　</w:t>
       </w:r>
-      <w:hyperlink w:history="1" r:id="rIdvf_kj0_8sx4ymz-fsx-1v">
+      <w:hyperlink w:history="1" r:id="rIdabdvgmqhvwcvunlll4vi0">
         <w:r>
           <w:rPr>
             <w:rStyle w:val="Hyperlink"/>
@@ -1630,7 +1630,7 @@
         </w:rPr>
         <w:t xml:space="preserve">2, 14　</w:t>
       </w:r>
-      <w:hyperlink w:history="1" r:id="rIdsf0zbqqjdvvt2cipilt0d">
+      <w:hyperlink w:history="1" r:id="rIdxsddpsyqtneyin0wrqdng">
         <w:r>
           <w:rPr>
             <w:rStyle w:val="Hyperlink"/>
@@ -1656,7 +1656,7 @@
         </w:rPr>
         <w:t xml:space="preserve">3, 8, 12　</w:t>
       </w:r>
-      <w:hyperlink w:history="1" r:id="rIdj7pvymj-f9tppop1pdbch">
+      <w:hyperlink w:history="1" r:id="rIdsfp6iz0lciu69gnugexbz">
         <w:r>
           <w:rPr>
             <w:rStyle w:val="Hyperlink"/>
@@ -1682,7 +1682,7 @@
         </w:rPr>
         <w:t xml:space="preserve">4　</w:t>
       </w:r>
-      <w:hyperlink w:history="1" r:id="rIdz1adkqwjonamv68u72drv">
+      <w:hyperlink w:history="1" r:id="rIdvobmss1d00tlzngfeimq-">
         <w:r>
           <w:rPr>
             <w:rStyle w:val="Hyperlink"/>
@@ -1708,7 +1708,7 @@
         </w:rPr>
         <w:t xml:space="preserve">5, 7　</w:t>
       </w:r>
-      <w:hyperlink w:history="1" r:id="rIdtfvgixaa5b3dn9aayzlam">
+      <w:hyperlink w:history="1" r:id="rIdxgukvsrg2xzctg2tkk4lb">
         <w:r>
           <w:rPr>
             <w:rStyle w:val="Hyperlink"/>
@@ -1734,7 +1734,7 @@
         </w:rPr>
         <w:t xml:space="preserve">6　</w:t>
       </w:r>
-      <w:hyperlink w:history="1" r:id="rIdd4tldf2p-bpsyuacfebpz">
+      <w:hyperlink w:history="1" r:id="rIdp6fddqqb6kimhdrhqq0rm">
         <w:r>
           <w:rPr>
             <w:rStyle w:val="Hyperlink"/>
@@ -1760,7 +1760,7 @@
         </w:rPr>
         <w:t xml:space="preserve">9　</w:t>
       </w:r>
-      <w:hyperlink w:history="1" r:id="rIdizy--ezavl4n95dhdelvh">
+      <w:hyperlink w:history="1" r:id="rIdcreis3sbo5twvrq1hfmms">
         <w:r>
           <w:rPr>
             <w:rStyle w:val="Hyperlink"/>
@@ -1786,7 +1786,7 @@
         </w:rPr>
         <w:t xml:space="preserve">10　</w:t>
       </w:r>
-      <w:hyperlink w:history="1" r:id="rIdoqfyvb8hoqj2vuk-9l4iy">
+      <w:hyperlink w:history="1" r:id="rIdricjqpqxssqllw6nxjr_x">
         <w:r>
           <w:rPr>
             <w:rStyle w:val="Hyperlink"/>
@@ -1812,7 +1812,7 @@
         </w:rPr>
         <w:t xml:space="preserve">11　</w:t>
       </w:r>
-      <w:hyperlink w:history="1" r:id="rIdyewjlayzur6wmmchuvroa">
+      <w:hyperlink w:history="1" r:id="rIdrwbnidpya0oiqhj1z5nmj">
         <w:r>
           <w:rPr>
             <w:rStyle w:val="Hyperlink"/>
@@ -1838,7 +1838,7 @@
         </w:rPr>
         <w:t xml:space="preserve">13　</w:t>
       </w:r>
-      <w:hyperlink w:history="1" r:id="rIddw7slm1pyn8nfdrcjol7y">
+      <w:hyperlink w:history="1" r:id="rId9wvad6zvzmjgbaukgkqmb">
         <w:r>
           <w:rPr>
             <w:rStyle w:val="Hyperlink"/>
@@ -1864,7 +1864,7 @@
           <w:sz w:val="28"/>
           <w:szCs w:val="28"/>
         </w:rPr>
-        <w:t xml:space="preserve">3. </w:t>
+        <w:t xml:space="preserve">3. 消防安全與走火</w:t>
       </w:r>
     </w:p>
     <w:p>
@@ -2576,7 +2576,7 @@
         </w:rPr>
         <w:t xml:space="preserve">1　</w:t>
       </w:r>
-      <w:hyperlink w:history="1" r:id="rIdpauqp-9np7xhxm3auxqzg">
+      <w:hyperlink w:history="1" r:id="rIdzlvpq-d3qg9xs69va7ydu">
         <w:r>
           <w:rPr>
             <w:rStyle w:val="Hyperlink"/>
@@ -2602,7 +2602,7 @@
         </w:rPr>
         <w:t xml:space="preserve">2, 3, 4　</w:t>
       </w:r>
-      <w:hyperlink w:history="1" r:id="rIddvy1z9kqn8qubpycbpoov">
+      <w:hyperlink w:history="1" r:id="rIdrgwwubs7evaneskz-4lsv">
         <w:r>
           <w:rPr>
             <w:rStyle w:val="Hyperlink"/>
@@ -2628,7 +2628,7 @@
         </w:rPr>
         <w:t xml:space="preserve">5　</w:t>
       </w:r>
-      <w:hyperlink w:history="1" r:id="rIdxegj-jarn99yv-sjp-drz">
+      <w:hyperlink w:history="1" r:id="rIdvwjkmwthn2zgm3q89m4po">
         <w:r>
           <w:rPr>
             <w:rStyle w:val="Hyperlink"/>
@@ -2654,7 +2654,7 @@
         </w:rPr>
         <w:t xml:space="preserve">6　</w:t>
       </w:r>
-      <w:hyperlink w:history="1" r:id="rIdl87-h5qljbv0wifchu3dh">
+      <w:hyperlink w:history="1" r:id="rIdxs3ic1xxfk53jjy3oq7hw">
         <w:r>
           <w:rPr>
             <w:rStyle w:val="Hyperlink"/>
@@ -2680,7 +2680,7 @@
         </w:rPr>
         <w:t xml:space="preserve">7　</w:t>
       </w:r>
-      <w:hyperlink w:history="1" r:id="rIddqxsd4vrwixptq0qnbnis">
+      <w:hyperlink w:history="1" r:id="rId8fxzqr6hwxncr5w-9jqei">
         <w:r>
           <w:rPr>
             <w:rStyle w:val="Hyperlink"/>
@@ -2706,7 +2706,7 @@
         </w:rPr>
         <w:t xml:space="preserve">8　</w:t>
       </w:r>
-      <w:hyperlink w:history="1" r:id="rId1rgc-xvg5ggaojvxpeqd7">
+      <w:hyperlink w:history="1" r:id="rId6rbltn94kxhb2pocgbbn9">
         <w:r>
           <w:rPr>
             <w:rStyle w:val="Hyperlink"/>
@@ -2732,7 +2732,7 @@
           <w:sz w:val="28"/>
           <w:szCs w:val="28"/>
         </w:rPr>
-        <w:t xml:space="preserve">4. </w:t>
+        <w:t xml:space="preserve">4. 氣體、電力及機電安全</w:t>
       </w:r>
     </w:p>
     <w:p>
@@ -3127,7 +3127,7 @@
         </w:rPr>
         <w:t xml:space="preserve">1　</w:t>
       </w:r>
-      <w:hyperlink w:history="1" r:id="rIdwi_bd04ugflfkhflz32lt">
+      <w:hyperlink w:history="1" r:id="rId1kkumrfkpifjxun1q-7wl">
         <w:r>
           <w:rPr>
             <w:rStyle w:val="Hyperlink"/>
@@ -3153,7 +3153,7 @@
         </w:rPr>
         <w:t xml:space="preserve">2　</w:t>
       </w:r>
-      <w:hyperlink w:history="1" r:id="rIdhhgbqs9jsdncph3s58v9q">
+      <w:hyperlink w:history="1" r:id="rIdxzlo53zjleoo8df1wu63k">
         <w:r>
           <w:rPr>
             <w:rStyle w:val="Hyperlink"/>
@@ -3179,7 +3179,7 @@
           <w:sz w:val="28"/>
           <w:szCs w:val="28"/>
         </w:rPr>
-        <w:t xml:space="preserve">5. </w:t>
+        <w:t xml:space="preserve">5. 樓宇維修與環境衞生</w:t>
       </w:r>
     </w:p>
     <w:p>
@@ -3203,7 +3203,7 @@
           <w:sz w:val="22"/>
           <w:szCs w:val="22"/>
         </w:rPr>
-        <w:t xml:space="preserve">本校重視校園環境的安全與衞生，致力提供一個安全、健康和安排妥善的校園環境，並與家長共同制訂及推行健康政策措施。本校須保持校舍環境的衞生，以營造健康的學習環境，讓幼兒在妥善照顧下成長學習。</w:t>
+        <w:t xml:space="preserve">本校須提供一個安全、健康和安排妥善的校園環境，並與家長共同制訂及推行健康政策措施。本校須保持校舍環境的衞生，以營造健康的學習環境。</w:t>
       </w:r>
       <w:r>
         <w:rPr>
@@ -3475,7 +3475,7 @@
           <w:sz w:val="22"/>
           <w:szCs w:val="22"/>
         </w:rPr>
-        <w:t xml:space="preserve">為維持環境衞生及保障幼兒健康，本校應定時使用家用漂白水（1:99）清潔傢具、設備和玩具，並應每星期更換一次兒童的床單、被套及枕套等。</w:t>
+        <w:t xml:space="preserve">本校應定時使用家用漂白水（1:99）清潔傢具、設備和玩具，並應每星期更換一次兒童的床單、被套及枕套等。</w:t>
       </w:r>
       <w:r>
         <w:rPr>
@@ -3509,7 +3509,7 @@
           <w:sz w:val="22"/>
           <w:szCs w:val="22"/>
         </w:rPr>
-        <w:t xml:space="preserve">本校供飲用、煮食和洗濯用的水須由自來水喉或其他認可的水源供應，確保用水安全衞生。</w:t>
+        <w:t xml:space="preserve">本校供飲用、煮食和洗濯用的水須由自來水喉或其他認可的水源供應。</w:t>
       </w:r>
       <w:r>
         <w:rPr>
@@ -3552,7 +3552,7 @@
         </w:rPr>
         <w:t xml:space="preserve">1　</w:t>
       </w:r>
-      <w:hyperlink w:history="1" r:id="rIdbsfuf8xo3catvrdsp1p6e">
+      <w:hyperlink w:history="1" r:id="rId5d52ns3yq2ph0esomeoqr">
         <w:r>
           <w:rPr>
             <w:rStyle w:val="Hyperlink"/>
@@ -3578,7 +3578,7 @@
         </w:rPr>
         <w:t xml:space="preserve">2　</w:t>
       </w:r>
-      <w:hyperlink w:history="1" r:id="rIdrhmlcglkgqs8gq6ju-aei">
+      <w:hyperlink w:history="1" r:id="rIdrwifsyygxho-uekktxzgs">
         <w:r>
           <w:rPr>
             <w:rStyle w:val="Hyperlink"/>
@@ -3604,7 +3604,7 @@
         </w:rPr>
         <w:t xml:space="preserve">3, 4　</w:t>
       </w:r>
-      <w:hyperlink w:history="1" r:id="rIdmhltvea6zv-tnys4kryu1">
+      <w:hyperlink w:history="1" r:id="rId3dqxpg6c3qlf9i1rjyza3">
         <w:r>
           <w:rPr>
             <w:rStyle w:val="Hyperlink"/>
@@ -3630,7 +3630,7 @@
           <w:sz w:val="28"/>
           <w:szCs w:val="28"/>
         </w:rPr>
-        <w:t xml:space="preserve">6. </w:t>
+        <w:t xml:space="preserve">6. 兒童健康檢查與紀錄</w:t>
       </w:r>
     </w:p>
     <w:p>
@@ -3654,7 +3654,7 @@
           <w:sz w:val="22"/>
           <w:szCs w:val="22"/>
         </w:rPr>
-        <w:t xml:space="preserve">兒童每日返抵本校園舍時，本校須隨即為其進行健康檢查，待確定其身體健康後方可入班；如發現病徵，應立即安排隔離，並通知家長帶回求醫。本校亦會定期檢查及記錄兒童體溫。兒童入讀本校之前，應接受一項由註冊醫生進行的全面體格檢查。</w:t>
+        <w:t xml:space="preserve">兒童返抵本校園舍時，本校須隨即為其進行健康檢查，並待確定其身體健康；如發現病徵，應立即安排隔離，並通知家長帶回求醫。兒童入讀本校之前，應接受一項全面的體格檢查。</w:t>
       </w:r>
       <w:r>
         <w:rPr>
@@ -3683,24 +3683,6 @@
           <w:vertAlign w:val="superscript"/>
         </w:rPr>
         <w:t xml:space="preserve">2</w:t>
-      </w:r>
-      <w:r>
-        <w:rPr>
-          <w:rFonts w:ascii="Microsoft JhengHei" w:cs="Microsoft JhengHei" w:eastAsia="Microsoft JhengHei" w:hAnsi="Microsoft JhengHei"/>
-          <w:sz w:val="22"/>
-          <w:szCs w:val="22"/>
-        </w:rPr>
-        <w:t xml:space="preserve"> </w:t>
-      </w:r>
-      <w:r>
-        <w:rPr>
-          <w:rFonts w:ascii="Microsoft JhengHei" w:cs="Microsoft JhengHei" w:eastAsia="Microsoft JhengHei" w:hAnsi="Microsoft JhengHei"/>
-          <w:color w:val="1F4E36"/>
-          <w:sz w:val="16"/>
-          <w:szCs w:val="16"/>
-          <w:vertAlign w:val="superscript"/>
-        </w:rPr>
-        <w:t xml:space="preserve">3</w:t>
       </w:r>
     </w:p>
     <w:p>
@@ -3724,7 +3706,25 @@
           <w:sz w:val="22"/>
           <w:szCs w:val="22"/>
         </w:rPr>
-        <w:t xml:space="preserve">本校須備有每名兒童的健康紀錄，並在適當時候更新，以供隨時查閱。本校亦須妥善保存學童個人健康紀錄及員工病假紀錄。健康紀錄內容至少包括下列各項：</w:t>
+        <w:t xml:space="preserve">本校須備有每名兒童的健康紀錄，並在適當時候更新，以供隨時查閱。本校亦須妥善保存學童個人健康紀錄及員工病假紀錄，並定期檢查及記錄兒童體溫。健康紀錄內容至少包括下列各項：</w:t>
+      </w:r>
+      <w:r>
+        <w:rPr>
+          <w:rFonts w:ascii="Microsoft JhengHei" w:cs="Microsoft JhengHei" w:eastAsia="Microsoft JhengHei" w:hAnsi="Microsoft JhengHei"/>
+          <w:color w:val="1F4E36"/>
+          <w:sz w:val="16"/>
+          <w:szCs w:val="16"/>
+          <w:vertAlign w:val="superscript"/>
+        </w:rPr>
+        <w:t xml:space="preserve">3</w:t>
+      </w:r>
+      <w:r>
+        <w:rPr>
+          <w:rFonts w:ascii="Microsoft JhengHei" w:cs="Microsoft JhengHei" w:eastAsia="Microsoft JhengHei" w:hAnsi="Microsoft JhengHei"/>
+          <w:sz w:val="22"/>
+          <w:szCs w:val="22"/>
+        </w:rPr>
+        <w:t xml:space="preserve"> </w:t>
       </w:r>
       <w:r>
         <w:rPr>
@@ -3735,24 +3735,6 @@
           <w:vertAlign w:val="superscript"/>
         </w:rPr>
         <w:t xml:space="preserve">4</w:t>
-      </w:r>
-      <w:r>
-        <w:rPr>
-          <w:rFonts w:ascii="Microsoft JhengHei" w:cs="Microsoft JhengHei" w:eastAsia="Microsoft JhengHei" w:hAnsi="Microsoft JhengHei"/>
-          <w:sz w:val="22"/>
-          <w:szCs w:val="22"/>
-        </w:rPr>
-        <w:t xml:space="preserve"> </w:t>
-      </w:r>
-      <w:r>
-        <w:rPr>
-          <w:rFonts w:ascii="Microsoft JhengHei" w:cs="Microsoft JhengHei" w:eastAsia="Microsoft JhengHei" w:hAnsi="Microsoft JhengHei"/>
-          <w:color w:val="1F4E36"/>
-          <w:sz w:val="16"/>
-          <w:szCs w:val="16"/>
-          <w:vertAlign w:val="superscript"/>
-        </w:rPr>
-        <w:t xml:space="preserve">5</w:t>
       </w:r>
     </w:p>
     <w:tbl>
@@ -4158,7 +4140,7 @@
           <w:szCs w:val="16"/>
           <w:vertAlign w:val="superscript"/>
         </w:rPr>
-        <w:t xml:space="preserve">6</w:t>
+        <w:t xml:space="preserve">5</w:t>
       </w:r>
     </w:p>
     <w:p>
@@ -4191,7 +4173,7 @@
         </w:rPr>
         <w:t xml:space="preserve">1　</w:t>
       </w:r>
-      <w:hyperlink w:history="1" r:id="rIdhufx1jv17nguxuh_bbkkz">
+      <w:hyperlink w:history="1" r:id="rIdiizjb1pl2vxni7_dmewdf">
         <w:r>
           <w:rPr>
             <w:rStyle w:val="Hyperlink"/>
@@ -4217,7 +4199,7 @@
         </w:rPr>
         <w:t xml:space="preserve">2　</w:t>
       </w:r>
-      <w:hyperlink w:history="1" r:id="rIdfi1kavaty69nwl8g4hn-4">
+      <w:hyperlink w:history="1" r:id="rId63w393n9eorkpknhv4w1k">
         <w:r>
           <w:rPr>
             <w:rStyle w:val="Hyperlink"/>
@@ -4241,9 +4223,35 @@
           <w:sz w:val="18"/>
           <w:szCs w:val="18"/>
         </w:rPr>
-        <w:t xml:space="preserve">3, 5　</w:t>
-      </w:r>
-      <w:hyperlink w:history="1" r:id="rIdbmgrexwlejgfrng1caxzf">
+        <w:t xml:space="preserve">3　</w:t>
+      </w:r>
+      <w:hyperlink w:history="1" r:id="rIdrjgs8rv2mxjzujcc1dyik">
+        <w:r>
+          <w:rPr>
+            <w:rStyle w:val="Hyperlink"/>
+            <w:rFonts w:ascii="Microsoft JhengHei" w:cs="Microsoft JhengHei" w:eastAsia="Microsoft JhengHei" w:hAnsi="Microsoft JhengHei"/>
+            <w:sz w:val="18"/>
+            <w:szCs w:val="18"/>
+          </w:rPr>
+          <w:t xml:space="preserve">《學前機構辦學手冊（2026年5月，第4.3版）》第 30 頁</w:t>
+        </w:r>
+      </w:hyperlink>
+    </w:p>
+    <w:p>
+      <w:pPr>
+        <w:spacing w:after="20"/>
+        <w:ind w:left="420" w:hanging="420"/>
+      </w:pPr>
+      <w:r>
+        <w:rPr>
+          <w:rFonts w:ascii="Microsoft JhengHei" w:cs="Microsoft JhengHei" w:eastAsia="Microsoft JhengHei" w:hAnsi="Microsoft JhengHei"/>
+          <w:color w:val="555555"/>
+          <w:sz w:val="18"/>
+          <w:szCs w:val="18"/>
+        </w:rPr>
+        <w:t xml:space="preserve">4　</w:t>
+      </w:r>
+      <w:hyperlink w:history="1" r:id="rId2qubvkwurbvldpl_sh_jf">
         <w:r>
           <w:rPr>
             <w:rStyle w:val="Hyperlink"/>
@@ -4267,35 +4275,9 @@
           <w:sz w:val="18"/>
           <w:szCs w:val="18"/>
         </w:rPr>
-        <w:t xml:space="preserve">4　</w:t>
-      </w:r>
-      <w:hyperlink w:history="1" r:id="rIdkhbe7fqwzugq0vkh2brt6">
-        <w:r>
-          <w:rPr>
-            <w:rStyle w:val="Hyperlink"/>
-            <w:rFonts w:ascii="Microsoft JhengHei" w:cs="Microsoft JhengHei" w:eastAsia="Microsoft JhengHei" w:hAnsi="Microsoft JhengHei"/>
-            <w:sz w:val="18"/>
-            <w:szCs w:val="18"/>
-          </w:rPr>
-          <w:t xml:space="preserve">《學前機構辦學手冊（2026年5月，第4.3版）》第 30 頁</w:t>
-        </w:r>
-      </w:hyperlink>
-    </w:p>
-    <w:p>
-      <w:pPr>
-        <w:spacing w:after="20"/>
-        <w:ind w:left="420" w:hanging="420"/>
-      </w:pPr>
-      <w:r>
-        <w:rPr>
-          <w:rFonts w:ascii="Microsoft JhengHei" w:cs="Microsoft JhengHei" w:eastAsia="Microsoft JhengHei" w:hAnsi="Microsoft JhengHei"/>
-          <w:color w:val="555555"/>
-          <w:sz w:val="18"/>
-          <w:szCs w:val="18"/>
-        </w:rPr>
-        <w:t xml:space="preserve">6　</w:t>
-      </w:r>
-      <w:hyperlink w:history="1" r:id="rIdeb3abhk2jvl0w5cgekmig">
+        <w:t xml:space="preserve">5　</w:t>
+      </w:r>
+      <w:hyperlink w:history="1" r:id="rIdb99ieekdaua0el-mkmj_s">
         <w:r>
           <w:rPr>
             <w:rStyle w:val="Hyperlink"/>
@@ -4321,7 +4303,7 @@
           <w:sz w:val="28"/>
           <w:szCs w:val="28"/>
         </w:rPr>
-        <w:t xml:space="preserve">7. </w:t>
+        <w:t xml:space="preserve">7. 疾病處理與傳染病防控</w:t>
       </w:r>
     </w:p>
     <w:p>
@@ -4543,7 +4525,7 @@
         </w:rPr>
         <w:t xml:space="preserve">1, 3　</w:t>
       </w:r>
-      <w:hyperlink w:history="1" r:id="rId_ozh6sisnhlp6jrmfjuqj">
+      <w:hyperlink w:history="1" r:id="rIdhipt4lio9ecqze2xbuwq2">
         <w:r>
           <w:rPr>
             <w:rStyle w:val="Hyperlink"/>
@@ -4569,7 +4551,7 @@
         </w:rPr>
         <w:t xml:space="preserve">2　</w:t>
       </w:r>
-      <w:hyperlink w:history="1" r:id="rIduphitqsfqmadmzbpeebas">
+      <w:hyperlink w:history="1" r:id="rId6eslfra6a57lhn_m8ubmb">
         <w:r>
           <w:rPr>
             <w:rStyle w:val="Hyperlink"/>
@@ -4595,7 +4577,7 @@
         </w:rPr>
         <w:t xml:space="preserve">4　</w:t>
       </w:r>
-      <w:hyperlink w:history="1" r:id="rIdlo-tuxexihyb_0ij7yepf">
+      <w:hyperlink w:history="1" r:id="rIdizfetpjjh7jxy5r0l_ulo">
         <w:r>
           <w:rPr>
             <w:rStyle w:val="Hyperlink"/>
@@ -4621,7 +4603,7 @@
         </w:rPr>
         <w:t xml:space="preserve">5　</w:t>
       </w:r>
-      <w:hyperlink w:history="1" r:id="rId_jncgzco0dzqfz9id5paw">
+      <w:hyperlink w:history="1" r:id="rIdjj4fh2tgny02lz5ipkuwt">
         <w:r>
           <w:rPr>
             <w:rStyle w:val="Hyperlink"/>
@@ -4647,7 +4629,7 @@
           <w:sz w:val="28"/>
           <w:szCs w:val="28"/>
         </w:rPr>
-        <w:t xml:space="preserve">8. </w:t>
+        <w:t xml:space="preserve">8. 膳食與食物安全</w:t>
       </w:r>
     </w:p>
     <w:p>
@@ -4922,7 +4904,7 @@
         </w:rPr>
         <w:t xml:space="preserve">1　</w:t>
       </w:r>
-      <w:hyperlink w:history="1" r:id="rId7tn858ktejj4kzcmbdp-k">
+      <w:hyperlink w:history="1" r:id="rIdscwxvai_rm8_k189l89_c">
         <w:r>
           <w:rPr>
             <w:rStyle w:val="Hyperlink"/>
@@ -4948,7 +4930,7 @@
         </w:rPr>
         <w:t xml:space="preserve">2　</w:t>
       </w:r>
-      <w:hyperlink w:history="1" r:id="rIdjy7q8gh_qy88biikmlrqv">
+      <w:hyperlink w:history="1" r:id="rId2_sveptruglxrwapo7e9z">
         <w:r>
           <w:rPr>
             <w:rStyle w:val="Hyperlink"/>
@@ -4974,7 +4956,7 @@
         </w:rPr>
         <w:t xml:space="preserve">3　</w:t>
       </w:r>
-      <w:hyperlink w:history="1" r:id="rIdkckzysftggrc5unrcflab">
+      <w:hyperlink w:history="1" r:id="rId9x_phywb7l8hqttctn_ma">
         <w:r>
           <w:rPr>
             <w:rStyle w:val="Hyperlink"/>
@@ -5000,7 +4982,7 @@
         </w:rPr>
         <w:t xml:space="preserve">4　</w:t>
       </w:r>
-      <w:hyperlink w:history="1" r:id="rId6i_axugf7dtkb4hax__tr">
+      <w:hyperlink w:history="1" r:id="rId7posixrrsp-hgxfwdru5s">
         <w:r>
           <w:rPr>
             <w:rStyle w:val="Hyperlink"/>
@@ -5026,7 +5008,7 @@
         </w:rPr>
         <w:t xml:space="preserve">5　</w:t>
       </w:r>
-      <w:hyperlink w:history="1" r:id="rId2vsmsfpjax6opcvgc0nzn">
+      <w:hyperlink w:history="1" r:id="rIdu4yxoyw5xvdzsjvjsnsqn">
         <w:r>
           <w:rPr>
             <w:rStyle w:val="Hyperlink"/>
@@ -5052,7 +5034,7 @@
         </w:rPr>
         <w:t xml:space="preserve">6　</w:t>
       </w:r>
-      <w:hyperlink w:history="1" r:id="rIdukipsdbp6dv_5p9ovbby0">
+      <w:hyperlink w:history="1" r:id="rIdpeaf76anrk_bdhptbc9i4">
         <w:r>
           <w:rPr>
             <w:rStyle w:val="Hyperlink"/>
@@ -5078,7 +5060,7 @@
         </w:rPr>
         <w:t xml:space="preserve">7　</w:t>
       </w:r>
-      <w:hyperlink w:history="1" r:id="rIderqe24ykpy17py8pbokbx">
+      <w:hyperlink w:history="1" r:id="rIdk9443gmzovltcn8yt302t">
         <w:r>
           <w:rPr>
             <w:rStyle w:val="Hyperlink"/>
@@ -5104,7 +5086,7 @@
         </w:rPr>
         <w:t xml:space="preserve">8　</w:t>
       </w:r>
-      <w:hyperlink w:history="1" r:id="rIdorxxc6rfjwb1wj9bdqvzz">
+      <w:hyperlink w:history="1" r:id="rId6a6jm_5gcc_5atei57ohn">
         <w:r>
           <w:rPr>
             <w:rStyle w:val="Hyperlink"/>
@@ -5130,7 +5112,7 @@
         </w:rPr>
         <w:t xml:space="preserve">9　</w:t>
       </w:r>
-      <w:hyperlink w:history="1" r:id="rIduazmxoiyvgawwo8ts791t">
+      <w:hyperlink w:history="1" r:id="rId_9kzzp8aprbjxh0amaxpp">
         <w:r>
           <w:rPr>
             <w:rStyle w:val="Hyperlink"/>
@@ -5156,7 +5138,7 @@
           <w:sz w:val="28"/>
           <w:szCs w:val="28"/>
         </w:rPr>
-        <w:t xml:space="preserve">9. </w:t>
+        <w:t xml:space="preserve">9. 意外、緊急事故與保險</w:t>
       </w:r>
     </w:p>
     <w:p>
@@ -5180,7 +5162,7 @@
           <w:sz w:val="22"/>
           <w:szCs w:val="22"/>
         </w:rPr>
-        <w:t xml:space="preserve">本校如遇特別事故，必須盡快通知社會福利署幼兒中心督導組，並必須在特別事故發生後的三個曆日（包括公眾假期）內向社會福利署幼兒中心督導組、津貼組及相關服務科（如適用）提交「幼兒中心特別事故報告」。處理完該宗緊急事故後，本校應適當地記錄事件的詳情和所採取的行動。</w:t>
+        <w:t xml:space="preserve">本校如設有留宿幼兒中心或獨立幼兒中心，遇特別事故時，必須盡快通知社會福利署幼兒中心督導組，並必須在特別事故發生後的三個曆日（包括公眾假期）內向社會福利署幼兒中心督導組、津貼組及相關服務科（如適用）提交「幼兒中心特別事故報告」。處理完該宗緊急事故後，本校應適當地記錄事件的詳情和所採取的行動。</w:t>
       </w:r>
       <w:r>
         <w:rPr>
@@ -5336,24 +5318,7 @@
           <w:sz w:val="22"/>
           <w:szCs w:val="22"/>
         </w:rPr>
-        <w:t xml:space="preserve">本校最少須有兩名教員曾接受急救訓練。本校</w:t>
-      </w:r>
-      <w:r>
-        <w:rPr>
-          <w:rFonts w:ascii="Microsoft JhengHei" w:cs="Microsoft JhengHei" w:eastAsia="Microsoft JhengHei" w:hAnsi="Microsoft JhengHei"/>
-          <w:sz w:val="22"/>
-          <w:szCs w:val="22"/>
-          <w:shd w:fill="FFF2B8" w:val="clear"/>
-        </w:rPr>
-        <w:t xml:space="preserve">指派專人</w:t>
-      </w:r>
-      <w:r>
-        <w:rPr>
-          <w:rFonts w:ascii="Microsoft JhengHei" w:cs="Microsoft JhengHei" w:eastAsia="Microsoft JhengHei" w:hAnsi="Microsoft JhengHei"/>
-          <w:sz w:val="22"/>
-          <w:szCs w:val="22"/>
-        </w:rPr>
-        <w:t xml:space="preserve">負責管理急救箱，負責管理急救箱的人士須確保急救箱內備有急救用品一覽表、所有藥物均貼上適當的標籤，並定期檢查急救用品的數量及有效日期，適時更換。</w:t>
+        <w:t xml:space="preserve">本校最少須有兩名教員曾接受急救訓練。負責管理急救箱的人士須確保急救箱內備有急救用品一覽表、所有藥物均貼上適當的標籤，並定期檢查急救用品的數量及有效日期，適時更換。</w:t>
       </w:r>
       <w:r>
         <w:rPr>
@@ -5466,7 +5431,7 @@
         </w:rPr>
         <w:t xml:space="preserve">1　</w:t>
       </w:r>
-      <w:hyperlink w:history="1" r:id="rIdlr-otbmclxdma1dqgmwnj">
+      <w:hyperlink w:history="1" r:id="rId3gpr5daox3d3knrdqomdu">
         <w:r>
           <w:rPr>
             <w:rStyle w:val="Hyperlink"/>
@@ -5492,7 +5457,7 @@
         </w:rPr>
         <w:t xml:space="preserve">2　</w:t>
       </w:r>
-      <w:hyperlink w:history="1" r:id="rIdifnzyvwuknhiu2fvanz4u">
+      <w:hyperlink w:history="1" r:id="rIdoiloub7joqfvsthzcqeq4">
         <w:r>
           <w:rPr>
             <w:rStyle w:val="Hyperlink"/>
@@ -5518,7 +5483,7 @@
         </w:rPr>
         <w:t xml:space="preserve">3　</w:t>
       </w:r>
-      <w:hyperlink w:history="1" r:id="rIdu3t_bkcidhxxdzw73b-qb">
+      <w:hyperlink w:history="1" r:id="rId_igbr-gymfja0yfqmxa3y">
         <w:r>
           <w:rPr>
             <w:rStyle w:val="Hyperlink"/>
@@ -5544,7 +5509,7 @@
         </w:rPr>
         <w:t xml:space="preserve">4　</w:t>
       </w:r>
-      <w:hyperlink w:history="1" r:id="rIdmhdcxak5ujmcfbr96zbbh">
+      <w:hyperlink w:history="1" r:id="rIdrmo7yag8tt5x7cxxnyviv">
         <w:r>
           <w:rPr>
             <w:rStyle w:val="Hyperlink"/>
@@ -5570,7 +5535,7 @@
         </w:rPr>
         <w:t xml:space="preserve">5　</w:t>
       </w:r>
-      <w:hyperlink w:history="1" r:id="rIdvb0e8h438xst2skwmceyl">
+      <w:hyperlink w:history="1" r:id="rIdrti3rgzd25owwrmb1mpoa">
         <w:r>
           <w:rPr>
             <w:rStyle w:val="Hyperlink"/>
@@ -5596,7 +5561,7 @@
         </w:rPr>
         <w:t xml:space="preserve">6　</w:t>
       </w:r>
-      <w:hyperlink w:history="1" r:id="rId79hlvo4t7r41v-wxdyzze">
+      <w:hyperlink w:history="1" r:id="rId-ib_dd2aaipkaqzjn9cjk">
         <w:r>
           <w:rPr>
             <w:rStyle w:val="Hyperlink"/>
@@ -5622,7 +5587,7 @@
         </w:rPr>
         <w:t xml:space="preserve">7　</w:t>
       </w:r>
-      <w:hyperlink w:history="1" r:id="rIdhhrtoi0pza5_ak_jwwoxz">
+      <w:hyperlink w:history="1" r:id="rIdesuqym9z95tut4wznkbfp">
         <w:r>
           <w:rPr>
             <w:rStyle w:val="Hyperlink"/>
@@ -5648,7 +5613,7 @@
         </w:rPr>
         <w:t xml:space="preserve">8　</w:t>
       </w:r>
-      <w:hyperlink w:history="1" r:id="rId2-ojqd69j5pibh8xqcxlk">
+      <w:hyperlink w:history="1" r:id="rIdjkqs_6bae-zfzxihw5enq">
         <w:r>
           <w:rPr>
             <w:rStyle w:val="Hyperlink"/>
@@ -5674,7 +5639,7 @@
         </w:rPr>
         <w:t xml:space="preserve">9　</w:t>
       </w:r>
-      <w:hyperlink w:history="1" r:id="rIdp4a6gx4shdcsmpdyhiyxu">
+      <w:hyperlink w:history="1" r:id="rIdwde7zsa-3xv4u1snmri4l">
         <w:r>
           <w:rPr>
             <w:rStyle w:val="Hyperlink"/>
@@ -5700,7 +5665,7 @@
         </w:rPr>
         <w:t xml:space="preserve">10　</w:t>
       </w:r>
-      <w:hyperlink w:history="1" r:id="rIdxq0sbceonnj_q_clp1bcx">
+      <w:hyperlink w:history="1" r:id="rIdozv0bpshdbojsgrndcjgk">
         <w:r>
           <w:rPr>
             <w:rStyle w:val="Hyperlink"/>
@@ -5726,7 +5691,7 @@
           <w:sz w:val="28"/>
           <w:szCs w:val="28"/>
         </w:rPr>
-        <w:t xml:space="preserve">10. </w:t>
+        <w:t xml:space="preserve">10. 兒童看管與保安</w:t>
       </w:r>
     </w:p>
     <w:p>
@@ -6313,7 +6278,7 @@
         </w:rPr>
         <w:t xml:space="preserve">1　</w:t>
       </w:r>
-      <w:hyperlink w:history="1" r:id="rIdvfxtjigmd-wdpyfxxcnfu">
+      <w:hyperlink w:history="1" r:id="rIdbiqvgc6ga3-8fcwvtrnmi">
         <w:r>
           <w:rPr>
             <w:rStyle w:val="Hyperlink"/>
@@ -6339,7 +6304,7 @@
         </w:rPr>
         <w:t xml:space="preserve">2, 6　</w:t>
       </w:r>
-      <w:hyperlink w:history="1" r:id="rIdokkrcgzkugi31tdfhzkgi">
+      <w:hyperlink w:history="1" r:id="rIdehlvaxwuzznooneolvarr">
         <w:r>
           <w:rPr>
             <w:rStyle w:val="Hyperlink"/>
@@ -6365,7 +6330,7 @@
         </w:rPr>
         <w:t xml:space="preserve">3　</w:t>
       </w:r>
-      <w:hyperlink w:history="1" r:id="rId9wwmt0r2u33muotamleq6">
+      <w:hyperlink w:history="1" r:id="rIduu6emz87s1oqoziear81y">
         <w:r>
           <w:rPr>
             <w:rStyle w:val="Hyperlink"/>
@@ -6391,7 +6356,7 @@
         </w:rPr>
         <w:t xml:space="preserve">4, 7　</w:t>
       </w:r>
-      <w:hyperlink w:history="1" r:id="rId830sw8tnj3ypg0rnfndnl">
+      <w:hyperlink w:history="1" r:id="rIdpo_bo-eu_wvxuji3na_kf">
         <w:r>
           <w:rPr>
             <w:rStyle w:val="Hyperlink"/>
@@ -6417,7 +6382,7 @@
         </w:rPr>
         <w:t xml:space="preserve">5　</w:t>
       </w:r>
-      <w:hyperlink w:history="1" r:id="rIdgsbfhhcb0ci7th2oz6asd">
+      <w:hyperlink w:history="1" r:id="rIdpozmqau5i8bmvcp7gqyld">
         <w:r>
           <w:rPr>
             <w:rStyle w:val="Hyperlink"/>
@@ -6443,7 +6408,7 @@
         </w:rPr>
         <w:t xml:space="preserve">8, 14　</w:t>
       </w:r>
-      <w:hyperlink w:history="1" r:id="rIdxc0esoxny3efo2xyeehca">
+      <w:hyperlink w:history="1" r:id="rIdbctzq9tmxkeqjek-m0x7e">
         <w:r>
           <w:rPr>
             <w:rStyle w:val="Hyperlink"/>
@@ -6469,7 +6434,7 @@
         </w:rPr>
         <w:t xml:space="preserve">9　</w:t>
       </w:r>
-      <w:hyperlink w:history="1" r:id="rId9iyuxfytdxkow-_f-tyz7">
+      <w:hyperlink w:history="1" r:id="rIdhgdb0kjmjutcoxark8r8j">
         <w:r>
           <w:rPr>
             <w:rStyle w:val="Hyperlink"/>
@@ -6495,7 +6460,7 @@
         </w:rPr>
         <w:t xml:space="preserve">10, 18　</w:t>
       </w:r>
-      <w:hyperlink w:history="1" r:id="rIdyffufyagxuxihrxhb0xj7">
+      <w:hyperlink w:history="1" r:id="rIdcjpdnj0gqzrtur8wa6wlt">
         <w:r>
           <w:rPr>
             <w:rStyle w:val="Hyperlink"/>
@@ -6521,7 +6486,7 @@
         </w:rPr>
         <w:t xml:space="preserve">11　</w:t>
       </w:r>
-      <w:hyperlink w:history="1" r:id="rIdbvhkxqfqhnjryzgk-z35w">
+      <w:hyperlink w:history="1" r:id="rIdyyvomqsgvx72pggmuyw7p">
         <w:r>
           <w:rPr>
             <w:rStyle w:val="Hyperlink"/>
@@ -6547,7 +6512,7 @@
         </w:rPr>
         <w:t xml:space="preserve">12　</w:t>
       </w:r>
-      <w:hyperlink w:history="1" r:id="rIdozkxueqqve2-n8zse8voh">
+      <w:hyperlink w:history="1" r:id="rIdt4viupj-6gyq0wzvnmb_h">
         <w:r>
           <w:rPr>
             <w:rStyle w:val="Hyperlink"/>
@@ -6573,7 +6538,7 @@
         </w:rPr>
         <w:t xml:space="preserve">13　</w:t>
       </w:r>
-      <w:hyperlink w:history="1" r:id="rIdec9tyh_nnef8mn1t6sboi">
+      <w:hyperlink w:history="1" r:id="rIdmmfz3o927nw1ls8177ahc">
         <w:r>
           <w:rPr>
             <w:rStyle w:val="Hyperlink"/>
@@ -6599,7 +6564,7 @@
         </w:rPr>
         <w:t xml:space="preserve">15　</w:t>
       </w:r>
-      <w:hyperlink w:history="1" r:id="rIdywatf8hnstt8cngxy4ro4">
+      <w:hyperlink w:history="1" r:id="rIdd75mdx6yprlxoyzjvx3rd">
         <w:r>
           <w:rPr>
             <w:rStyle w:val="Hyperlink"/>
@@ -6625,7 +6590,7 @@
         </w:rPr>
         <w:t xml:space="preserve">16　</w:t>
       </w:r>
-      <w:hyperlink w:history="1" r:id="rIdln2qsnbbgjxekkntl2gki">
+      <w:hyperlink w:history="1" r:id="rIdff-rnj5wfokv_j2rwy-9w">
         <w:r>
           <w:rPr>
             <w:rStyle w:val="Hyperlink"/>
@@ -6651,7 +6616,7 @@
         </w:rPr>
         <w:t xml:space="preserve">17　</w:t>
       </w:r>
-      <w:hyperlink w:history="1" r:id="rId1ufy7udsbnkt1atb9f82n">
+      <w:hyperlink w:history="1" r:id="rIdpwaa6g8sgwmrccdvngcit">
         <w:r>
           <w:rPr>
             <w:rStyle w:val="Hyperlink"/>
@@ -6677,7 +6642,7 @@
         </w:rPr>
         <w:t xml:space="preserve">19　</w:t>
       </w:r>
-      <w:hyperlink w:history="1" r:id="rIddliwy8bue8qs3yohsl_fq">
+      <w:hyperlink w:history="1" r:id="rId3ixevbr-gnf2bejvb8y3z">
         <w:r>
           <w:rPr>
             <w:rStyle w:val="Hyperlink"/>
@@ -6703,7 +6668,7 @@
           <w:sz w:val="28"/>
           <w:szCs w:val="28"/>
         </w:rPr>
-        <w:t xml:space="preserve">11. </w:t>
+        <w:t xml:space="preserve">11. 戶外活動與惡劣天氣安排</w:t>
       </w:r>
     </w:p>
     <w:p>
@@ -6873,7 +6838,7 @@
         </w:rPr>
         <w:t xml:space="preserve">1　</w:t>
       </w:r>
-      <w:hyperlink w:history="1" r:id="rIdsflpofpp4uegx5ca50pte">
+      <w:hyperlink w:history="1" r:id="rId-lx3e6skxhpemg8vpm9ts">
         <w:r>
           <w:rPr>
             <w:rStyle w:val="Hyperlink"/>
@@ -6899,7 +6864,7 @@
         </w:rPr>
         <w:t xml:space="preserve">2　</w:t>
       </w:r>
-      <w:hyperlink w:history="1" r:id="rIdpklq97mczzmttwevworsp">
+      <w:hyperlink w:history="1" r:id="rId_5ji-ptvy-crq4fqu7gt4">
         <w:r>
           <w:rPr>
             <w:rStyle w:val="Hyperlink"/>
@@ -6925,7 +6890,7 @@
         </w:rPr>
         <w:t xml:space="preserve">3　</w:t>
       </w:r>
-      <w:hyperlink w:history="1" r:id="rId_u_qfjbwbjzxsishfvx_a">
+      <w:hyperlink w:history="1" r:id="rIdfe8s_xf04msc-w2mkipmp">
         <w:r>
           <w:rPr>
             <w:rStyle w:val="Hyperlink"/>
@@ -6951,7 +6916,7 @@
         </w:rPr>
         <w:t xml:space="preserve">4　</w:t>
       </w:r>
-      <w:hyperlink w:history="1" r:id="rIdvrjznde1cuf_isilyf_et">
+      <w:hyperlink w:history="1" r:id="rIdidweqtmfcrfpgrzo4irow">
         <w:r>
           <w:rPr>
             <w:rStyle w:val="Hyperlink"/>
@@ -6977,7 +6942,7 @@
           <w:sz w:val="28"/>
           <w:szCs w:val="28"/>
         </w:rPr>
-        <w:t xml:space="preserve">12. </w:t>
+        <w:t xml:space="preserve">12. 教職員聘任、資歷與師生比例</w:t>
       </w:r>
     </w:p>
     <w:p>
@@ -8361,7 +8326,7 @@
         </w:rPr>
         <w:t xml:space="preserve">1, 7　</w:t>
       </w:r>
-      <w:hyperlink w:history="1" r:id="rIdiirv1kgazbdfckauo0b_2">
+      <w:hyperlink w:history="1" r:id="rIdd_b11dbwv4-teub-nh34p">
         <w:r>
           <w:rPr>
             <w:rStyle w:val="Hyperlink"/>
@@ -8387,7 +8352,7 @@
         </w:rPr>
         <w:t xml:space="preserve">2, 8　</w:t>
       </w:r>
-      <w:hyperlink w:history="1" r:id="rId0l0art-ee63ciie3u0fkw">
+      <w:hyperlink w:history="1" r:id="rIdor9e2bj9h0ox3ra05auic">
         <w:r>
           <w:rPr>
             <w:rStyle w:val="Hyperlink"/>
@@ -8413,7 +8378,7 @@
         </w:rPr>
         <w:t xml:space="preserve">3　</w:t>
       </w:r>
-      <w:hyperlink w:history="1" r:id="rIdauz0qrjazngyfyvungf7j">
+      <w:hyperlink w:history="1" r:id="rIdcio8duhmj-0eiu9hihgte">
         <w:r>
           <w:rPr>
             <w:rStyle w:val="Hyperlink"/>
@@ -8439,7 +8404,7 @@
         </w:rPr>
         <w:t xml:space="preserve">4　</w:t>
       </w:r>
-      <w:hyperlink w:history="1" r:id="rId5w0spvynh_5caal_uifyw">
+      <w:hyperlink w:history="1" r:id="rIdss1jsgms7fcexckttakuz">
         <w:r>
           <w:rPr>
             <w:rStyle w:val="Hyperlink"/>
@@ -8465,7 +8430,7 @@
         </w:rPr>
         <w:t xml:space="preserve">5, 9　</w:t>
       </w:r>
-      <w:hyperlink w:history="1" r:id="rIdwxzbp9eppulewzcxnjs-k">
+      <w:hyperlink w:history="1" r:id="rId2vwox_6wdbwikc14wk9gu">
         <w:r>
           <w:rPr>
             <w:rStyle w:val="Hyperlink"/>
@@ -8491,7 +8456,7 @@
         </w:rPr>
         <w:t xml:space="preserve">6　</w:t>
       </w:r>
-      <w:hyperlink w:history="1" r:id="rIdmdkf7tpyljvrglqc3jsoc">
+      <w:hyperlink w:history="1" r:id="rIdqcnr-syxuketd3d5qzcvk">
         <w:r>
           <w:rPr>
             <w:rStyle w:val="Hyperlink"/>
@@ -8517,7 +8482,7 @@
         </w:rPr>
         <w:t xml:space="preserve">10, 12, 15, 16, 35　</w:t>
       </w:r>
-      <w:hyperlink w:history="1" r:id="rIdhnllf1qpymuefxdywgutm">
+      <w:hyperlink w:history="1" r:id="rIdoihr-thvrl4r0nkwflrh6">
         <w:r>
           <w:rPr>
             <w:rStyle w:val="Hyperlink"/>
@@ -8543,7 +8508,7 @@
         </w:rPr>
         <w:t xml:space="preserve">11, 14, 23, 34　</w:t>
       </w:r>
-      <w:hyperlink w:history="1" r:id="rId3ua2kmfnbq75q2oll1sxq">
+      <w:hyperlink w:history="1" r:id="rIdnyc5kpib4jieefmdxlvc1">
         <w:r>
           <w:rPr>
             <w:rStyle w:val="Hyperlink"/>
@@ -8569,7 +8534,7 @@
         </w:rPr>
         <w:t xml:space="preserve">13, 17　</w:t>
       </w:r>
-      <w:hyperlink w:history="1" r:id="rIde9agirgffvhfecfaqxgli">
+      <w:hyperlink w:history="1" r:id="rIdg-hhm5_cilzw0bkmfmt9b">
         <w:r>
           <w:rPr>
             <w:rStyle w:val="Hyperlink"/>
@@ -8595,7 +8560,7 @@
         </w:rPr>
         <w:t xml:space="preserve">18, 24　</w:t>
       </w:r>
-      <w:hyperlink w:history="1" r:id="rIdkfgvkqhnsmtomvzagqsv6">
+      <w:hyperlink w:history="1" r:id="rId4wliijdmbkukdqbxoh7qd">
         <w:r>
           <w:rPr>
             <w:rStyle w:val="Hyperlink"/>
@@ -8621,7 +8586,7 @@
         </w:rPr>
         <w:t xml:space="preserve">19, 22　</w:t>
       </w:r>
-      <w:hyperlink w:history="1" r:id="rIdhirlegikfjqreepiyld5h">
+      <w:hyperlink w:history="1" r:id="rIdbypng30pqzzqcwrkz0mge">
         <w:r>
           <w:rPr>
             <w:rStyle w:val="Hyperlink"/>
@@ -8647,7 +8612,7 @@
         </w:rPr>
         <w:t xml:space="preserve">20, 32　</w:t>
       </w:r>
-      <w:hyperlink w:history="1" r:id="rIdq8-mygjzqabzrbaqamzcy">
+      <w:hyperlink w:history="1" r:id="rIddeefcwqcfrcaxelfzfe8x">
         <w:r>
           <w:rPr>
             <w:rStyle w:val="Hyperlink"/>
@@ -8673,7 +8638,7 @@
         </w:rPr>
         <w:t xml:space="preserve">21　</w:t>
       </w:r>
-      <w:hyperlink w:history="1" r:id="rIdspn8aml8x1oraj46rnysk">
+      <w:hyperlink w:history="1" r:id="rIdgpm_z333fr8uibud74e9h">
         <w:r>
           <w:rPr>
             <w:rStyle w:val="Hyperlink"/>
@@ -8699,7 +8664,7 @@
         </w:rPr>
         <w:t xml:space="preserve">25　</w:t>
       </w:r>
-      <w:hyperlink w:history="1" r:id="rIdbxfr2uh_zmoszqlols_mo">
+      <w:hyperlink w:history="1" r:id="rIdq29riwlhakkg2twjavwhu">
         <w:r>
           <w:rPr>
             <w:rStyle w:val="Hyperlink"/>
@@ -8725,7 +8690,7 @@
         </w:rPr>
         <w:t xml:space="preserve">26　</w:t>
       </w:r>
-      <w:hyperlink w:history="1" r:id="rIdbelrny8o8cc39n1jqnvlt">
+      <w:hyperlink w:history="1" r:id="rIdgkec0mdosvf5irqsfiwg3">
         <w:r>
           <w:rPr>
             <w:rStyle w:val="Hyperlink"/>
@@ -8751,7 +8716,7 @@
         </w:rPr>
         <w:t xml:space="preserve">27　</w:t>
       </w:r>
-      <w:hyperlink w:history="1" r:id="rIdnrcuvjtqvnlha7cvgmjc5">
+      <w:hyperlink w:history="1" r:id="rIdxg5lzqnditapbcjczmjyg">
         <w:r>
           <w:rPr>
             <w:rStyle w:val="Hyperlink"/>
@@ -8777,7 +8742,7 @@
         </w:rPr>
         <w:t xml:space="preserve">28　</w:t>
       </w:r>
-      <w:hyperlink w:history="1" r:id="rIdwxbzifvwbnxazgcw_toto">
+      <w:hyperlink w:history="1" r:id="rIds_gmjox7lhipze69h8heu">
         <w:r>
           <w:rPr>
             <w:rStyle w:val="Hyperlink"/>
@@ -8803,7 +8768,7 @@
         </w:rPr>
         <w:t xml:space="preserve">29, 31　</w:t>
       </w:r>
-      <w:hyperlink w:history="1" r:id="rIdakio4cjgnhqeb-nhqutr8">
+      <w:hyperlink w:history="1" r:id="rId77z4uexe8kruyzrpywk5f">
         <w:r>
           <w:rPr>
             <w:rStyle w:val="Hyperlink"/>
@@ -8829,7 +8794,7 @@
         </w:rPr>
         <w:t xml:space="preserve">30　</w:t>
       </w:r>
-      <w:hyperlink w:history="1" r:id="rIdj9vts5ioibrgylikrwhub">
+      <w:hyperlink w:history="1" r:id="rIdtiyxcmvn_ncjdmt3ohglb">
         <w:r>
           <w:rPr>
             <w:rStyle w:val="Hyperlink"/>
@@ -8855,7 +8820,7 @@
         </w:rPr>
         <w:t xml:space="preserve">33　</w:t>
       </w:r>
-      <w:hyperlink w:history="1" r:id="rIdcdbdc2dy_3lfebjzkfoju">
+      <w:hyperlink w:history="1" r:id="rIdfpksnhsys2agxu8gyrfyv">
         <w:r>
           <w:rPr>
             <w:rStyle w:val="Hyperlink"/>
@@ -8881,7 +8846,7 @@
         </w:rPr>
         <w:t xml:space="preserve">36　</w:t>
       </w:r>
-      <w:hyperlink w:history="1" r:id="rIdavc59smise0mpttt3q8sa">
+      <w:hyperlink w:history="1" r:id="rIdxdo5swv-w0w4pk8dvj_g-">
         <w:r>
           <w:rPr>
             <w:rStyle w:val="Hyperlink"/>
@@ -8907,7 +8872,7 @@
         </w:rPr>
         <w:t xml:space="preserve">37　</w:t>
       </w:r>
-      <w:hyperlink w:history="1" r:id="rId3jryctlpt-10yjvkdysmx">
+      <w:hyperlink w:history="1" r:id="rId6dpqpvm4j0t2afbfiqoye">
         <w:r>
           <w:rPr>
             <w:rStyle w:val="Hyperlink"/>
@@ -8933,7 +8898,7 @@
         </w:rPr>
         <w:t xml:space="preserve">38　</w:t>
       </w:r>
-      <w:hyperlink w:history="1" r:id="rIdaha8i9yym1lz25xv04jax">
+      <w:hyperlink w:history="1" r:id="rIddkayxn6menchwm7ow2xlg">
         <w:r>
           <w:rPr>
             <w:rStyle w:val="Hyperlink"/>
@@ -8959,7 +8924,7 @@
           <w:sz w:val="28"/>
           <w:szCs w:val="28"/>
         </w:rPr>
-        <w:t xml:space="preserve">13. </w:t>
+        <w:t xml:space="preserve">13. 教職員健康、操守與專業發展</w:t>
       </w:r>
     </w:p>
     <w:p>
@@ -8983,7 +8948,7 @@
           <w:sz w:val="22"/>
           <w:szCs w:val="22"/>
         </w:rPr>
-        <w:t xml:space="preserve">本校管理當局（已成立校董會者為校董會，未設者為校董會）就學校、校董（包括校監）和教職員接受利益和捐贈事宜，制定政策及發出清晰指引，確保採購、收生、招聘及擢升等行政事務廉潔治校。所制定的政策須包括學校、校董及教職員接受利益和捐贈的準則、批核程序、審批權、問責機制及監管程序。本校接受任何利益和捐贈，必須獲本校管理當局批准（經教育局核准的註冊費不屬利益）。本校亦遵守教育局有關《學校及其教職員收受利益和捐贈事宜》通告的規定。</w:t>
+        <w:t xml:space="preserve">本校管理當局（已成立校董會者為校董會，未設者為校董會）就學校、校董（包括校監）和教職員接受利益和捐贈事宜，制定政策及發出清晰指引，確保採購、收生、招聘及擢升等行政事務廉潔治校。所制定的政策須包括學校、校董及教職員接受利益和捐贈的準則、批核程序、審批權、問責機制及監管程序。本校接受任何利益和捐贈，必須獲本校管理當局批准。本校亦遵守教育局有關《學校及其教職員收受利益和捐贈事宜》通告的規定，並參考廉政公署《校董及職員行為守則範本》。</w:t>
       </w:r>
       <w:r>
         <w:rPr>
@@ -9495,7 +9460,7 @@
                 <w:sz w:val="20"/>
                 <w:szCs w:val="20"/>
               </w:rPr>
-              <w:t xml:space="preserve">管理人員須要求員工即時向中心管理人員報告</w:t>
+              <w:t xml:space="preserve">管理人員須要求員工即時向中心管理人員報告，並在調查或訴訟完結後，即時向中心管理人員報告結果</w:t>
             </w:r>
           </w:p>
         </w:tc>
@@ -9914,7 +9879,7 @@
         </w:rPr>
         <w:t xml:space="preserve">1　</w:t>
       </w:r>
-      <w:hyperlink w:history="1" r:id="rIdxnmnma0uqjo-iwirix6zb">
+      <w:hyperlink w:history="1" r:id="rIdxfsb4myaoatk7e9ipq62r">
         <w:r>
           <w:rPr>
             <w:rStyle w:val="Hyperlink"/>
@@ -9940,7 +9905,7 @@
         </w:rPr>
         <w:t xml:space="preserve">2　</w:t>
       </w:r>
-      <w:hyperlink w:history="1" r:id="rIdccflgmanvlweont_adcj8">
+      <w:hyperlink w:history="1" r:id="rId3ayi12vcfzbyt6q-uaara">
         <w:r>
           <w:rPr>
             <w:rStyle w:val="Hyperlink"/>
@@ -9966,7 +9931,7 @@
         </w:rPr>
         <w:t xml:space="preserve">3　</w:t>
       </w:r>
-      <w:hyperlink w:history="1" r:id="rIdbcmb-optve332otdeq7ix">
+      <w:hyperlink w:history="1" r:id="rId_wfcdymbg09uzzvi-qidr">
         <w:r>
           <w:rPr>
             <w:rStyle w:val="Hyperlink"/>
@@ -9992,7 +9957,7 @@
         </w:rPr>
         <w:t xml:space="preserve">4　</w:t>
       </w:r>
-      <w:hyperlink w:history="1" r:id="rId6xxjqbh4fvbmkbhditvod">
+      <w:hyperlink w:history="1" r:id="rIdfp6cnesd3xusftujcxyhn">
         <w:r>
           <w:rPr>
             <w:rStyle w:val="Hyperlink"/>
@@ -10018,7 +9983,7 @@
         </w:rPr>
         <w:t xml:space="preserve">5　</w:t>
       </w:r>
-      <w:hyperlink w:history="1" r:id="rIdsvgm6qskp_a5tnfctnjqo">
+      <w:hyperlink w:history="1" r:id="rId88of27mxggggcz0ht28vm">
         <w:r>
           <w:rPr>
             <w:rStyle w:val="Hyperlink"/>
@@ -10044,7 +10009,7 @@
         </w:rPr>
         <w:t xml:space="preserve">6, 10　</w:t>
       </w:r>
-      <w:hyperlink w:history="1" r:id="rIds6y7mmn1-rfssfcjvxlaw">
+      <w:hyperlink w:history="1" r:id="rIdil1m5bhdzpw7rh_c2wi6v">
         <w:r>
           <w:rPr>
             <w:rStyle w:val="Hyperlink"/>
@@ -10070,7 +10035,7 @@
         </w:rPr>
         <w:t xml:space="preserve">7　</w:t>
       </w:r>
-      <w:hyperlink w:history="1" r:id="rIdojn8ikv1buwggar2h_avy">
+      <w:hyperlink w:history="1" r:id="rId4y3yfbnssewhtcxj27ooq">
         <w:r>
           <w:rPr>
             <w:rStyle w:val="Hyperlink"/>
@@ -10096,7 +10061,7 @@
         </w:rPr>
         <w:t xml:space="preserve">8, 11　</w:t>
       </w:r>
-      <w:hyperlink w:history="1" r:id="rIdm_k4qsukd9l0vtjeujs3p">
+      <w:hyperlink w:history="1" r:id="rIdun6vv5qtkgjzj96t97j1h">
         <w:r>
           <w:rPr>
             <w:rStyle w:val="Hyperlink"/>
@@ -10122,7 +10087,7 @@
         </w:rPr>
         <w:t xml:space="preserve">9　</w:t>
       </w:r>
-      <w:hyperlink w:history="1" r:id="rIdgql9tctirrgjvpftlbplk">
+      <w:hyperlink w:history="1" r:id="rIdhaualwuo1rr1yhbz_rts4">
         <w:r>
           <w:rPr>
             <w:rStyle w:val="Hyperlink"/>
@@ -10148,7 +10113,7 @@
         </w:rPr>
         <w:t xml:space="preserve">12　</w:t>
       </w:r>
-      <w:hyperlink w:history="1" r:id="rIdfsmwkulipoqgga7zdin9a">
+      <w:hyperlink w:history="1" r:id="rIdmftpyacvfmadq0-tr2yyc">
         <w:r>
           <w:rPr>
             <w:rStyle w:val="Hyperlink"/>
@@ -10174,7 +10139,7 @@
         </w:rPr>
         <w:t xml:space="preserve">13　</w:t>
       </w:r>
-      <w:hyperlink w:history="1" r:id="rIdy67bwjafnkvbirjokb2l_">
+      <w:hyperlink w:history="1" r:id="rIdkzzuw5qlzndc0rvme-xps">
         <w:r>
           <w:rPr>
             <w:rStyle w:val="Hyperlink"/>
@@ -10200,7 +10165,7 @@
         </w:rPr>
         <w:t xml:space="preserve">14　</w:t>
       </w:r>
-      <w:hyperlink w:history="1" r:id="rIdhji6c6rptngclxkvvscz3">
+      <w:hyperlink w:history="1" r:id="rIdiwfponllxtzjmcxfbnl-j">
         <w:r>
           <w:rPr>
             <w:rStyle w:val="Hyperlink"/>
@@ -10226,7 +10191,7 @@
         </w:rPr>
         <w:t xml:space="preserve">15, 17　</w:t>
       </w:r>
-      <w:hyperlink w:history="1" r:id="rIdozy6hwmy6ppksolk8vxeg">
+      <w:hyperlink w:history="1" r:id="rIdjurdmwtbewdwww1lzpbgo">
         <w:r>
           <w:rPr>
             <w:rStyle w:val="Hyperlink"/>
@@ -10252,7 +10217,7 @@
         </w:rPr>
         <w:t xml:space="preserve">16　</w:t>
       </w:r>
-      <w:hyperlink w:history="1" r:id="rIdw_eviokjzmld3t5whwfbo">
+      <w:hyperlink w:history="1" r:id="rIdukiishgngirtihfs5hidf">
         <w:r>
           <w:rPr>
             <w:rStyle w:val="Hyperlink"/>
@@ -10278,7 +10243,7 @@
         </w:rPr>
         <w:t xml:space="preserve">18　</w:t>
       </w:r>
-      <w:hyperlink w:history="1" r:id="rIdbvi-cgczu_90vozwyv6o9">
+      <w:hyperlink w:history="1" r:id="rIdxrvrkt7mw6xya7dhvuy8k">
         <w:r>
           <w:rPr>
             <w:rStyle w:val="Hyperlink"/>
@@ -10304,7 +10269,7 @@
         </w:rPr>
         <w:t xml:space="preserve">19　</w:t>
       </w:r>
-      <w:hyperlink w:history="1" r:id="rIdph9ubxf1bm6vpctbsdpvr">
+      <w:hyperlink w:history="1" r:id="rIdoz7crpzrvbt7qym6bteim">
         <w:r>
           <w:rPr>
             <w:rStyle w:val="Hyperlink"/>
@@ -10330,7 +10295,7 @@
         </w:rPr>
         <w:t xml:space="preserve">20　</w:t>
       </w:r>
-      <w:hyperlink w:history="1" r:id="rIdhiz9mcyzuz5_t6jqoionr">
+      <w:hyperlink w:history="1" r:id="rIdpm2jaosygtliiofjyzj6k">
         <w:r>
           <w:rPr>
             <w:rStyle w:val="Hyperlink"/>
@@ -10356,7 +10321,7 @@
         </w:rPr>
         <w:t xml:space="preserve">21　</w:t>
       </w:r>
-      <w:hyperlink w:history="1" r:id="rIdf-sbjnf7gi5syttrtngjy">
+      <w:hyperlink w:history="1" r:id="rId7srumibxcnkghoakbb9e4">
         <w:r>
           <w:rPr>
             <w:rStyle w:val="Hyperlink"/>
@@ -10382,7 +10347,7 @@
         </w:rPr>
         <w:t xml:space="preserve">22　</w:t>
       </w:r>
-      <w:hyperlink w:history="1" r:id="rIdazra2f848jewkregro-t7">
+      <w:hyperlink w:history="1" r:id="rIdovy_uxpeaov1sxzzgvs-v">
         <w:r>
           <w:rPr>
             <w:rStyle w:val="Hyperlink"/>
@@ -10408,7 +10373,7 @@
         </w:rPr>
         <w:t xml:space="preserve">23　</w:t>
       </w:r>
-      <w:hyperlink w:history="1" r:id="rIdovew6jnrs21joau_akqt-">
+      <w:hyperlink w:history="1" r:id="rIdivdnnkqt96juutasxr1qu">
         <w:r>
           <w:rPr>
             <w:rStyle w:val="Hyperlink"/>
@@ -10434,7 +10399,7 @@
           <w:sz w:val="28"/>
           <w:szCs w:val="28"/>
         </w:rPr>
-        <w:t xml:space="preserve">14. </w:t>
+        <w:t xml:space="preserve">14. 學費及收費</w:t>
       </w:r>
     </w:p>
     <w:p>
@@ -11573,7 +11538,7 @@
         </w:rPr>
         <w:t xml:space="preserve">1, 5, 9　</w:t>
       </w:r>
-      <w:hyperlink w:history="1" r:id="rId09jdzv2cza1ulqtervy0q">
+      <w:hyperlink w:history="1" r:id="rIdzeejxnyubcyn1sx0ojeuy">
         <w:r>
           <w:rPr>
             <w:rStyle w:val="Hyperlink"/>
@@ -11599,7 +11564,7 @@
         </w:rPr>
         <w:t xml:space="preserve">2, 6, 24　</w:t>
       </w:r>
-      <w:hyperlink w:history="1" r:id="rId94nayf2b3cbn2rzu6l4hm">
+      <w:hyperlink w:history="1" r:id="rId-lp1h6jighkeongtgdi5o">
         <w:r>
           <w:rPr>
             <w:rStyle w:val="Hyperlink"/>
@@ -11625,7 +11590,7 @@
         </w:rPr>
         <w:t xml:space="preserve">3, 7, 10　</w:t>
       </w:r>
-      <w:hyperlink w:history="1" r:id="rIdkhumca7ky687d_qsm3bl2">
+      <w:hyperlink w:history="1" r:id="rIdb-u23dslz5ahw3h-3yubm">
         <w:r>
           <w:rPr>
             <w:rStyle w:val="Hyperlink"/>
@@ -11651,7 +11616,7 @@
         </w:rPr>
         <w:t xml:space="preserve">4, 23　</w:t>
       </w:r>
-      <w:hyperlink w:history="1" r:id="rIdlr9v5tbi4o3d9fqja8jqm">
+      <w:hyperlink w:history="1" r:id="rId_ahgcgtxs8u_zgpvtisuw">
         <w:r>
           <w:rPr>
             <w:rStyle w:val="Hyperlink"/>
@@ -11677,7 +11642,7 @@
         </w:rPr>
         <w:t xml:space="preserve">8, 20, 21　</w:t>
       </w:r>
-      <w:hyperlink w:history="1" r:id="rIdg3ydsw76ow8yxrn7tbytc">
+      <w:hyperlink w:history="1" r:id="rIdlvn3f_jzbbdfvcwtsdebg">
         <w:r>
           <w:rPr>
             <w:rStyle w:val="Hyperlink"/>
@@ -11703,7 +11668,7 @@
         </w:rPr>
         <w:t xml:space="preserve">11, 14, 16, 17, 19　</w:t>
       </w:r>
-      <w:hyperlink w:history="1" r:id="rIdx3sxxqxpzygl-c1mfvdep">
+      <w:hyperlink w:history="1" r:id="rIdilxuhcxfr9vpxellclyqa">
         <w:r>
           <w:rPr>
             <w:rStyle w:val="Hyperlink"/>
@@ -11729,7 +11694,7 @@
         </w:rPr>
         <w:t xml:space="preserve">12　</w:t>
       </w:r>
-      <w:hyperlink w:history="1" r:id="rIdjs2xkpqw1hgxgxnnbsuru">
+      <w:hyperlink w:history="1" r:id="rIdrawitr3mwwbqygzkcwdv9">
         <w:r>
           <w:rPr>
             <w:rStyle w:val="Hyperlink"/>
@@ -11755,7 +11720,7 @@
         </w:rPr>
         <w:t xml:space="preserve">13, 26　</w:t>
       </w:r>
-      <w:hyperlink w:history="1" r:id="rIdbjwhzcl8vdofnsujf6avh">
+      <w:hyperlink w:history="1" r:id="rIdgef1has5g8ijt1yi-t4me">
         <w:r>
           <w:rPr>
             <w:rStyle w:val="Hyperlink"/>
@@ -11781,7 +11746,7 @@
         </w:rPr>
         <w:t xml:space="preserve">15, 18, 22, 27　</w:t>
       </w:r>
-      <w:hyperlink w:history="1" r:id="rIddpykifv4hgxjslhv-4sp2">
+      <w:hyperlink w:history="1" r:id="rIdb9aufxbazkghjvz3o5qfr">
         <w:r>
           <w:rPr>
             <w:rStyle w:val="Hyperlink"/>
@@ -11807,7 +11772,7 @@
         </w:rPr>
         <w:t xml:space="preserve">25　</w:t>
       </w:r>
-      <w:hyperlink w:history="1" r:id="rIdzfjplrsgka3lzul7e0mg0">
+      <w:hyperlink w:history="1" r:id="rIdlt69j0nphvykadci9c623">
         <w:r>
           <w:rPr>
             <w:rStyle w:val="Hyperlink"/>
@@ -11833,7 +11798,7 @@
         </w:rPr>
         <w:t xml:space="preserve">28　</w:t>
       </w:r>
-      <w:hyperlink w:history="1" r:id="rIdczwdcrfi4sbxica1qtse1">
+      <w:hyperlink w:history="1" r:id="rIdrtmhp1dg8kukuebgjbzew">
         <w:r>
           <w:rPr>
             <w:rStyle w:val="Hyperlink"/>
@@ -11859,7 +11824,7 @@
         </w:rPr>
         <w:t xml:space="preserve">29　</w:t>
       </w:r>
-      <w:hyperlink w:history="1" r:id="rIdlsyzuljc8sfcjcqgj4nps">
+      <w:hyperlink w:history="1" r:id="rIdjlxd3c2p9vauo6fi4h_lb">
         <w:r>
           <w:rPr>
             <w:rStyle w:val="Hyperlink"/>
@@ -11885,7 +11850,7 @@
         </w:rPr>
         <w:t xml:space="preserve">30　</w:t>
       </w:r>
-      <w:hyperlink w:history="1" r:id="rId3oea4_jkwqe_y85lfsvwy">
+      <w:hyperlink w:history="1" r:id="rId6d-bprsm2cvggcm5fci8g">
         <w:r>
           <w:rPr>
             <w:rStyle w:val="Hyperlink"/>
@@ -11911,7 +11876,7 @@
         </w:rPr>
         <w:t xml:space="preserve">31　</w:t>
       </w:r>
-      <w:hyperlink w:history="1" r:id="rIdycyksdpevqiz7cyi5zgao">
+      <w:hyperlink w:history="1" r:id="rId24c7iahoqkzsmhtqwcrwn">
         <w:r>
           <w:rPr>
             <w:rStyle w:val="Hyperlink"/>
@@ -11937,7 +11902,7 @@
           <w:sz w:val="28"/>
           <w:szCs w:val="28"/>
         </w:rPr>
-        <w:t xml:space="preserve">15. </w:t>
+        <w:t xml:space="preserve">15. 採購及招標</w:t>
       </w:r>
     </w:p>
     <w:p>
@@ -12031,7 +11996,7 @@
           <w:sz w:val="22"/>
           <w:szCs w:val="22"/>
         </w:rPr>
-        <w:t xml:space="preserve">為確保採購過程廉潔及問責，本校須要求所有負責採購職務的人員簽署</w:t>
+        <w:t xml:space="preserve">本校須要求所有負責採購職務的人員簽署</w:t>
       </w:r>
       <w:r>
         <w:rPr>
@@ -12785,7 +12750,7 @@
         </w:rPr>
         <w:t xml:space="preserve">1, 4　</w:t>
       </w:r>
-      <w:hyperlink w:history="1" r:id="rIdvwb-c96hqubx0mx28vayr">
+      <w:hyperlink w:history="1" r:id="rIdbvuhmovvalia3j-7_hukb">
         <w:r>
           <w:rPr>
             <w:rStyle w:val="Hyperlink"/>
@@ -12811,7 +12776,7 @@
         </w:rPr>
         <w:t xml:space="preserve">2, 7　</w:t>
       </w:r>
-      <w:hyperlink w:history="1" r:id="rIdmwm25ywfty-ktd92lm_ex">
+      <w:hyperlink w:history="1" r:id="rId1ljljcrgo2mtckgxpwl5p">
         <w:r>
           <w:rPr>
             <w:rStyle w:val="Hyperlink"/>
@@ -12837,7 +12802,7 @@
         </w:rPr>
         <w:t xml:space="preserve">3　</w:t>
       </w:r>
-      <w:hyperlink w:history="1" r:id="rId0j38v9lmng043ilhef2mo">
+      <w:hyperlink w:history="1" r:id="rIdogsylduqnnfby_hjvfnpe">
         <w:r>
           <w:rPr>
             <w:rStyle w:val="Hyperlink"/>
@@ -12863,7 +12828,7 @@
         </w:rPr>
         <w:t xml:space="preserve">5　</w:t>
       </w:r>
-      <w:hyperlink w:history="1" r:id="rIdyk6anvhv9hak4ovnkme_d">
+      <w:hyperlink w:history="1" r:id="rIdihaaaw-a3bsszz9ef5c3p">
         <w:r>
           <w:rPr>
             <w:rStyle w:val="Hyperlink"/>
@@ -12889,7 +12854,7 @@
         </w:rPr>
         <w:t xml:space="preserve">6, 8　</w:t>
       </w:r>
-      <w:hyperlink w:history="1" r:id="rIdiwgw-hrlnpxk-0fy2tl-0">
+      <w:hyperlink w:history="1" r:id="rIdd0lr8wv2mjfmk_dnjpfxd">
         <w:r>
           <w:rPr>
             <w:rStyle w:val="Hyperlink"/>
@@ -12915,7 +12880,7 @@
         </w:rPr>
         <w:t xml:space="preserve">9　</w:t>
       </w:r>
-      <w:hyperlink w:history="1" r:id="rIdxdw34i5arh9zz3akpyqwn">
+      <w:hyperlink w:history="1" r:id="rIdwtc_s06_4kpcse9tzutl5">
         <w:r>
           <w:rPr>
             <w:rStyle w:val="Hyperlink"/>
@@ -12941,7 +12906,7 @@
         </w:rPr>
         <w:t xml:space="preserve">10, 11, 12　</w:t>
       </w:r>
-      <w:hyperlink w:history="1" r:id="rId-9zc405y_wcu_gycyuhld">
+      <w:hyperlink w:history="1" r:id="rIdchj3jdoi35nc7vfvoeip1">
         <w:r>
           <w:rPr>
             <w:rStyle w:val="Hyperlink"/>
@@ -12967,7 +12932,7 @@
         </w:rPr>
         <w:t xml:space="preserve">13　</w:t>
       </w:r>
-      <w:hyperlink w:history="1" r:id="rIdumzmh5wugkxu5unwsvzcz">
+      <w:hyperlink w:history="1" r:id="rIdj5f7k7j5zjxqeeq6fllfw">
         <w:r>
           <w:rPr>
             <w:rStyle w:val="Hyperlink"/>
@@ -12993,7 +12958,7 @@
         </w:rPr>
         <w:t xml:space="preserve">14　</w:t>
       </w:r>
-      <w:hyperlink w:history="1" r:id="rIdqx7nfdbay5_lbfleysquh">
+      <w:hyperlink w:history="1" r:id="rIdqttzlxerrcqxi_c0ukqqx">
         <w:r>
           <w:rPr>
             <w:rStyle w:val="Hyperlink"/>
@@ -13019,7 +12984,7 @@
           <w:sz w:val="28"/>
           <w:szCs w:val="28"/>
         </w:rPr>
-        <w:t xml:space="preserve">16. </w:t>
+        <w:t xml:space="preserve">16. 財務管理及內部監控</w:t>
       </w:r>
     </w:p>
     <w:p>
@@ -14676,7 +14641,7 @@
         </w:rPr>
         <w:t xml:space="preserve">1, 25　</w:t>
       </w:r>
-      <w:hyperlink w:history="1" r:id="rIdd_0b6yz73aqunsn9hc9tx">
+      <w:hyperlink w:history="1" r:id="rIdpfj0amfjjnels2oxvklcz">
         <w:r>
           <w:rPr>
             <w:rStyle w:val="Hyperlink"/>
@@ -14702,7 +14667,7 @@
         </w:rPr>
         <w:t xml:space="preserve">2, 6　</w:t>
       </w:r>
-      <w:hyperlink w:history="1" r:id="rIdec1t3kuhmbdafdaqxwubc">
+      <w:hyperlink w:history="1" r:id="rIdvfumobiocrv-e_d978nqv">
         <w:r>
           <w:rPr>
             <w:rStyle w:val="Hyperlink"/>
@@ -14728,7 +14693,7 @@
         </w:rPr>
         <w:t xml:space="preserve">3　</w:t>
       </w:r>
-      <w:hyperlink w:history="1" r:id="rIdruzddhmnybvrkfascu6hx">
+      <w:hyperlink w:history="1" r:id="rIdyyvxg5ltnznriqe6pejd_">
         <w:r>
           <w:rPr>
             <w:rStyle w:val="Hyperlink"/>
@@ -14754,7 +14719,7 @@
         </w:rPr>
         <w:t xml:space="preserve">4, 9　</w:t>
       </w:r>
-      <w:hyperlink w:history="1" r:id="rIdhdrx3kxmtsfzaofb-7vyh">
+      <w:hyperlink w:history="1" r:id="rIdd_8ofeyqzh1l-rt8gqvbo">
         <w:r>
           <w:rPr>
             <w:rStyle w:val="Hyperlink"/>
@@ -14780,7 +14745,7 @@
         </w:rPr>
         <w:t xml:space="preserve">5　</w:t>
       </w:r>
-      <w:hyperlink w:history="1" r:id="rIdi0cd86v-ussapfzlmj1ar">
+      <w:hyperlink w:history="1" r:id="rIdn70pmlwaaqcatooa84kzh">
         <w:r>
           <w:rPr>
             <w:rStyle w:val="Hyperlink"/>
@@ -14806,7 +14771,7 @@
         </w:rPr>
         <w:t xml:space="preserve">7　</w:t>
       </w:r>
-      <w:hyperlink w:history="1" r:id="rIddrixdwhlm8j2svkqzqzsc">
+      <w:hyperlink w:history="1" r:id="rIdvqolxngslkdyshbxnh2y_">
         <w:r>
           <w:rPr>
             <w:rStyle w:val="Hyperlink"/>
@@ -14832,7 +14797,7 @@
         </w:rPr>
         <w:t xml:space="preserve">8　</w:t>
       </w:r>
-      <w:hyperlink w:history="1" r:id="rIdgoagcdslaby1ls5imw2uc">
+      <w:hyperlink w:history="1" r:id="rIdtpruke2knz2snsuj1oghm">
         <w:r>
           <w:rPr>
             <w:rStyle w:val="Hyperlink"/>
@@ -14858,7 +14823,7 @@
         </w:rPr>
         <w:t xml:space="preserve">10　</w:t>
       </w:r>
-      <w:hyperlink w:history="1" r:id="rIdeqoffv2rqff88okiofuif">
+      <w:hyperlink w:history="1" r:id="rIde0w9gimk3poy9ojteuqg3">
         <w:r>
           <w:rPr>
             <w:rStyle w:val="Hyperlink"/>
@@ -14884,7 +14849,7 @@
         </w:rPr>
         <w:t xml:space="preserve">11　</w:t>
       </w:r>
-      <w:hyperlink w:history="1" r:id="rIdbud4kdl1ci8rlcyykkejg">
+      <w:hyperlink w:history="1" r:id="rId195k_qe6iox1wsk80siqj">
         <w:r>
           <w:rPr>
             <w:rStyle w:val="Hyperlink"/>
@@ -14910,7 +14875,7 @@
         </w:rPr>
         <w:t xml:space="preserve">12　</w:t>
       </w:r>
-      <w:hyperlink w:history="1" r:id="rIdbaaxhklymvzgnewwqjebs">
+      <w:hyperlink w:history="1" r:id="rIdir4hnyxfodys6oeltixaz">
         <w:r>
           <w:rPr>
             <w:rStyle w:val="Hyperlink"/>
@@ -14936,7 +14901,7 @@
         </w:rPr>
         <w:t xml:space="preserve">13, 24, 28　</w:t>
       </w:r>
-      <w:hyperlink w:history="1" r:id="rIdzqqvwbg-qi0uayzbjek3j">
+      <w:hyperlink w:history="1" r:id="rId5oug2osb9eqk_eiwc1hvu">
         <w:r>
           <w:rPr>
             <w:rStyle w:val="Hyperlink"/>
@@ -14962,7 +14927,7 @@
         </w:rPr>
         <w:t xml:space="preserve">14, 16　</w:t>
       </w:r>
-      <w:hyperlink w:history="1" r:id="rIdvvaysnje_xlrtdh7gjje4">
+      <w:hyperlink w:history="1" r:id="rIdg8327_-cxnjztqm8mhltw">
         <w:r>
           <w:rPr>
             <w:rStyle w:val="Hyperlink"/>
@@ -14988,7 +14953,7 @@
         </w:rPr>
         <w:t xml:space="preserve">15　</w:t>
       </w:r>
-      <w:hyperlink w:history="1" r:id="rIdmwl8yy2gxyjygofdlmfti">
+      <w:hyperlink w:history="1" r:id="rIdn-jicvyhn1scknx9t4rdr">
         <w:r>
           <w:rPr>
             <w:rStyle w:val="Hyperlink"/>
@@ -15014,7 +14979,7 @@
         </w:rPr>
         <w:t xml:space="preserve">17, 20, 22　</w:t>
       </w:r>
-      <w:hyperlink w:history="1" r:id="rIdrfellgye7dehyr1m6fdua">
+      <w:hyperlink w:history="1" r:id="rIdnfrijbs8rl20eyuu9ju4l">
         <w:r>
           <w:rPr>
             <w:rStyle w:val="Hyperlink"/>
@@ -15040,7 +15005,7 @@
         </w:rPr>
         <w:t xml:space="preserve">18, 19, 23　</w:t>
       </w:r>
-      <w:hyperlink w:history="1" r:id="rIdqxl3bu1j53ib5xapmpdfq">
+      <w:hyperlink w:history="1" r:id="rIde5u8p2ttb2fjiydjm3nbx">
         <w:r>
           <w:rPr>
             <w:rStyle w:val="Hyperlink"/>
@@ -15066,7 +15031,7 @@
         </w:rPr>
         <w:t xml:space="preserve">21, 26　</w:t>
       </w:r>
-      <w:hyperlink w:history="1" r:id="rIdhtpejmufs6ndchntj25cr">
+      <w:hyperlink w:history="1" r:id="rId7rocjzd2ugawota-sgoew">
         <w:r>
           <w:rPr>
             <w:rStyle w:val="Hyperlink"/>
@@ -15092,7 +15057,7 @@
         </w:rPr>
         <w:t xml:space="preserve">27, 33　</w:t>
       </w:r>
-      <w:hyperlink w:history="1" r:id="rIduiviukjoy2iot7id7a6a1">
+      <w:hyperlink w:history="1" r:id="rIdt2ajbgn-uswaqmduozhnc">
         <w:r>
           <w:rPr>
             <w:rStyle w:val="Hyperlink"/>
@@ -15118,7 +15083,7 @@
         </w:rPr>
         <w:t xml:space="preserve">29　</w:t>
       </w:r>
-      <w:hyperlink w:history="1" r:id="rId3wznf0hqslinxihfcdugb">
+      <w:hyperlink w:history="1" r:id="rIdzugbsyjmc-qkvhbe1gauj">
         <w:r>
           <w:rPr>
             <w:rStyle w:val="Hyperlink"/>
@@ -15144,7 +15109,7 @@
         </w:rPr>
         <w:t xml:space="preserve">30　</w:t>
       </w:r>
-      <w:hyperlink w:history="1" r:id="rId77zfqfvdt94nb4vbfcmyl">
+      <w:hyperlink w:history="1" r:id="rIdp8i5xkjqptasnsbfdpwyl">
         <w:r>
           <w:rPr>
             <w:rStyle w:val="Hyperlink"/>
@@ -15170,7 +15135,7 @@
         </w:rPr>
         <w:t xml:space="preserve">31　</w:t>
       </w:r>
-      <w:hyperlink w:history="1" r:id="rIdoqn_pp3zgye8bxzysqa2i">
+      <w:hyperlink w:history="1" r:id="rId4tivfouqktlxrjdxgbab6">
         <w:r>
           <w:rPr>
             <w:rStyle w:val="Hyperlink"/>
@@ -15196,7 +15161,7 @@
         </w:rPr>
         <w:t xml:space="preserve">32　</w:t>
       </w:r>
-      <w:hyperlink w:history="1" r:id="rIdiikszszemdmtdqpsvoyse">
+      <w:hyperlink w:history="1" r:id="rIdaxelrkcouydix9wbibnt5">
         <w:r>
           <w:rPr>
             <w:rStyle w:val="Hyperlink"/>
@@ -15222,7 +15187,7 @@
         </w:rPr>
         <w:t xml:space="preserve">34　</w:t>
       </w:r>
-      <w:hyperlink w:history="1" r:id="rId5ui3nu1eszgv_gd48ikot">
+      <w:hyperlink w:history="1" r:id="rIdpqrb6bwtfwvzhljiporuz">
         <w:r>
           <w:rPr>
             <w:rStyle w:val="Hyperlink"/>
@@ -15248,7 +15213,7 @@
         </w:rPr>
         <w:t xml:space="preserve">35　</w:t>
       </w:r>
-      <w:hyperlink w:history="1" r:id="rIdjy1xzycuemsjchtj7rgx9">
+      <w:hyperlink w:history="1" r:id="rIdjrdtxkek4eao_j4hljfzd">
         <w:r>
           <w:rPr>
             <w:rStyle w:val="Hyperlink"/>
@@ -15274,7 +15239,7 @@
         </w:rPr>
         <w:t xml:space="preserve">36, 37　</w:t>
       </w:r>
-      <w:hyperlink w:history="1" r:id="rIdsbj_lhwmlkjiqhittzrg1">
+      <w:hyperlink w:history="1" r:id="rId3ttr6ibyv40w6d47v3kxm">
         <w:r>
           <w:rPr>
             <w:rStyle w:val="Hyperlink"/>
@@ -15300,7 +15265,7 @@
         </w:rPr>
         <w:t xml:space="preserve">38　</w:t>
       </w:r>
-      <w:hyperlink w:history="1" r:id="rId7jz9jhw0rqc-z1sno7hr6">
+      <w:hyperlink w:history="1" r:id="rIdfvy4iaa9pjoxq5xo9zitz">
         <w:r>
           <w:rPr>
             <w:rStyle w:val="Hyperlink"/>
@@ -15326,7 +15291,7 @@
         </w:rPr>
         <w:t xml:space="preserve">39　</w:t>
       </w:r>
-      <w:hyperlink w:history="1" r:id="rIddcrb1-uhf7pj05df5rjqc">
+      <w:hyperlink w:history="1" r:id="rIdiuum1o2o0ql9doyvthlut">
         <w:r>
           <w:rPr>
             <w:rStyle w:val="Hyperlink"/>
@@ -15352,7 +15317,7 @@
         </w:rPr>
         <w:t xml:space="preserve">40　</w:t>
       </w:r>
-      <w:hyperlink w:history="1" r:id="rIdqtpumzd2abffk7ideqadg">
+      <w:hyperlink w:history="1" r:id="rIdkx1gpm19wxponeuirhwlf">
         <w:r>
           <w:rPr>
             <w:rStyle w:val="Hyperlink"/>
@@ -15378,7 +15343,7 @@
         </w:rPr>
         <w:t xml:space="preserve">41　</w:t>
       </w:r>
-      <w:hyperlink w:history="1" r:id="rIdmz1i7dy6vgv3cjtxpcrhz">
+      <w:hyperlink w:history="1" r:id="rIdrqdiy-ro-njv3koksaf6i">
         <w:r>
           <w:rPr>
             <w:rStyle w:val="Hyperlink"/>
@@ -15404,7 +15369,7 @@
           <w:sz w:val="28"/>
           <w:szCs w:val="28"/>
         </w:rPr>
-        <w:t xml:space="preserve">17. </w:t>
+        <w:t xml:space="preserve">17. 資助運用、籌款及盈餘</w:t>
       </w:r>
     </w:p>
     <w:p>
@@ -16246,7 +16211,7 @@
         </w:rPr>
         <w:t xml:space="preserve">1　</w:t>
       </w:r>
-      <w:hyperlink w:history="1" r:id="rIdm4ojrnen03wcuyvkxhqum">
+      <w:hyperlink w:history="1" r:id="rIdorzndukzgywq6z5ibloqs">
         <w:r>
           <w:rPr>
             <w:rStyle w:val="Hyperlink"/>
@@ -16272,7 +16237,7 @@
         </w:rPr>
         <w:t xml:space="preserve">2, 15　</w:t>
       </w:r>
-      <w:hyperlink w:history="1" r:id="rIdclbahrbq_sgiqttoxzgp5">
+      <w:hyperlink w:history="1" r:id="rIdvmwnbo2gujyzfcyq-2qgg">
         <w:r>
           <w:rPr>
             <w:rStyle w:val="Hyperlink"/>
@@ -16298,7 +16263,7 @@
         </w:rPr>
         <w:t xml:space="preserve">3　</w:t>
       </w:r>
-      <w:hyperlink w:history="1" r:id="rId_gj8cibd2-80y-_lstygt">
+      <w:hyperlink w:history="1" r:id="rIdw_qw_0h7lawln9si-qxrt">
         <w:r>
           <w:rPr>
             <w:rStyle w:val="Hyperlink"/>
@@ -16324,7 +16289,7 @@
         </w:rPr>
         <w:t xml:space="preserve">4　</w:t>
       </w:r>
-      <w:hyperlink w:history="1" r:id="rIdfqauccvcz3-sk777o5stn">
+      <w:hyperlink w:history="1" r:id="rIdl0ygxm3ldbvp9t18afbya">
         <w:r>
           <w:rPr>
             <w:rStyle w:val="Hyperlink"/>
@@ -16350,7 +16315,7 @@
         </w:rPr>
         <w:t xml:space="preserve">5, 7　</w:t>
       </w:r>
-      <w:hyperlink w:history="1" r:id="rIdpesa6tmzpmuapvyt2pvbw">
+      <w:hyperlink w:history="1" r:id="rIdrn-asqbwd5g8f_g7_uunb">
         <w:r>
           <w:rPr>
             <w:rStyle w:val="Hyperlink"/>
@@ -16376,7 +16341,7 @@
         </w:rPr>
         <w:t xml:space="preserve">6　</w:t>
       </w:r>
-      <w:hyperlink w:history="1" r:id="rIddvxzu6hov5bof9dt8z4hz">
+      <w:hyperlink w:history="1" r:id="rIdtnatocmb-l7klz0le1x2i">
         <w:r>
           <w:rPr>
             <w:rStyle w:val="Hyperlink"/>
@@ -16402,7 +16367,7 @@
         </w:rPr>
         <w:t xml:space="preserve">8, 10　</w:t>
       </w:r>
-      <w:hyperlink w:history="1" r:id="rIdnkhsl_v-qjpujbgbkf7el">
+      <w:hyperlink w:history="1" r:id="rIdzh1ykgsvfbepulfz1tdhc">
         <w:r>
           <w:rPr>
             <w:rStyle w:val="Hyperlink"/>
@@ -16428,7 +16393,7 @@
         </w:rPr>
         <w:t xml:space="preserve">9　</w:t>
       </w:r>
-      <w:hyperlink w:history="1" r:id="rIdmlmtqiuozz4qo12_nygss">
+      <w:hyperlink w:history="1" r:id="rIdoavtbn5zwsk4k2zywidub">
         <w:r>
           <w:rPr>
             <w:rStyle w:val="Hyperlink"/>
@@ -16454,7 +16419,7 @@
         </w:rPr>
         <w:t xml:space="preserve">11　</w:t>
       </w:r>
-      <w:hyperlink w:history="1" r:id="rIdu95hiyyk7qdeuwiy_dm5w">
+      <w:hyperlink w:history="1" r:id="rIdpwd0hd_0pumyj_n07w-1h">
         <w:r>
           <w:rPr>
             <w:rStyle w:val="Hyperlink"/>
@@ -16480,7 +16445,7 @@
         </w:rPr>
         <w:t xml:space="preserve">12　</w:t>
       </w:r>
-      <w:hyperlink w:history="1" r:id="rIdw2rhx-5gp5vnkxfk-3lzx">
+      <w:hyperlink w:history="1" r:id="rIdp61r6lvdlotvuxln__iuz">
         <w:r>
           <w:rPr>
             <w:rStyle w:val="Hyperlink"/>
@@ -16506,7 +16471,7 @@
         </w:rPr>
         <w:t xml:space="preserve">13　</w:t>
       </w:r>
-      <w:hyperlink w:history="1" r:id="rId7ff9mnvbffdohdihvi8yy">
+      <w:hyperlink w:history="1" r:id="rIdohaaiwbflb-lgfjhemv7r">
         <w:r>
           <w:rPr>
             <w:rStyle w:val="Hyperlink"/>
@@ -16532,7 +16497,7 @@
         </w:rPr>
         <w:t xml:space="preserve">14　</w:t>
       </w:r>
-      <w:hyperlink w:history="1" r:id="rIdu1tk3sfnq-42zczxqhl4d">
+      <w:hyperlink w:history="1" r:id="rIdrlwcnyyygkoyfhchffr7e">
         <w:r>
           <w:rPr>
             <w:rStyle w:val="Hyperlink"/>
@@ -16558,7 +16523,7 @@
         </w:rPr>
         <w:t xml:space="preserve">16　</w:t>
       </w:r>
-      <w:hyperlink w:history="1" r:id="rIdxoyl6_kjkguswka4e7dj6">
+      <w:hyperlink w:history="1" r:id="rIdht9in-uejx-7wcur3zszy">
         <w:r>
           <w:rPr>
             <w:rStyle w:val="Hyperlink"/>
@@ -16584,7 +16549,7 @@
         </w:rPr>
         <w:t xml:space="preserve">17　</w:t>
       </w:r>
-      <w:hyperlink w:history="1" r:id="rIdaftvw81kvr8uhd01cb-wn">
+      <w:hyperlink w:history="1" r:id="rIdaa-knusmeexcdwsumv4k2">
         <w:r>
           <w:rPr>
             <w:rStyle w:val="Hyperlink"/>
@@ -16610,7 +16575,7 @@
         </w:rPr>
         <w:t xml:space="preserve">18　</w:t>
       </w:r>
-      <w:hyperlink w:history="1" r:id="rIdblv241c0fev0ocsy1jyr_">
+      <w:hyperlink w:history="1" r:id="rId1tpdhityt_s9ruzfubbrx">
         <w:r>
           <w:rPr>
             <w:rStyle w:val="Hyperlink"/>
@@ -16636,7 +16601,7 @@
           <w:sz w:val="28"/>
           <w:szCs w:val="28"/>
         </w:rPr>
-        <w:t xml:space="preserve">18. </w:t>
+        <w:t xml:space="preserve">18. 註冊、牌照與行政呈報</w:t>
       </w:r>
     </w:p>
     <w:p>
@@ -17623,7 +17588,7 @@
         </w:rPr>
         <w:t xml:space="preserve">1　</w:t>
       </w:r>
-      <w:hyperlink w:history="1" r:id="rId7sczweld3w6rag32nwaob">
+      <w:hyperlink w:history="1" r:id="rId38thmjiqa37nq-jpss0_3">
         <w:r>
           <w:rPr>
             <w:rStyle w:val="Hyperlink"/>
@@ -17649,7 +17614,7 @@
         </w:rPr>
         <w:t xml:space="preserve">2　</w:t>
       </w:r>
-      <w:hyperlink w:history="1" r:id="rIdw1n03ax0fozojw-jr-9t-">
+      <w:hyperlink w:history="1" r:id="rIdngsu5up-ahlty-nvyhkwz">
         <w:r>
           <w:rPr>
             <w:rStyle w:val="Hyperlink"/>
@@ -17675,7 +17640,7 @@
         </w:rPr>
         <w:t xml:space="preserve">3　</w:t>
       </w:r>
-      <w:hyperlink w:history="1" r:id="rIdfgzawno5zy-yvl-dyx3wh">
+      <w:hyperlink w:history="1" r:id="rIdxpgbckf-7t5pa5w_hdian">
         <w:r>
           <w:rPr>
             <w:rStyle w:val="Hyperlink"/>
@@ -17701,7 +17666,7 @@
         </w:rPr>
         <w:t xml:space="preserve">4　</w:t>
       </w:r>
-      <w:hyperlink w:history="1" r:id="rId0u7m81no2pfq3aaoystyv">
+      <w:hyperlink w:history="1" r:id="rIdzwgilccikgsegjrdq0z88">
         <w:r>
           <w:rPr>
             <w:rStyle w:val="Hyperlink"/>
@@ -17727,7 +17692,7 @@
         </w:rPr>
         <w:t xml:space="preserve">5　</w:t>
       </w:r>
-      <w:hyperlink w:history="1" r:id="rId7snrprk-u2nwjnbcp1rkz">
+      <w:hyperlink w:history="1" r:id="rIdphilnajdwhhxntv-relda">
         <w:r>
           <w:rPr>
             <w:rStyle w:val="Hyperlink"/>
@@ -17753,7 +17718,7 @@
         </w:rPr>
         <w:t xml:space="preserve">6　</w:t>
       </w:r>
-      <w:hyperlink w:history="1" r:id="rIdwihdqu7k-_ajzj8uh1bqc">
+      <w:hyperlink w:history="1" r:id="rId2w0jvr3jasdybfgp9lp0y">
         <w:r>
           <w:rPr>
             <w:rStyle w:val="Hyperlink"/>
@@ -17779,7 +17744,7 @@
         </w:rPr>
         <w:t xml:space="preserve">7　</w:t>
       </w:r>
-      <w:hyperlink w:history="1" r:id="rIdptf2z_s-4aumwws8zoo8f">
+      <w:hyperlink w:history="1" r:id="rId_pwbczmgmayobr4myqbef">
         <w:r>
           <w:rPr>
             <w:rStyle w:val="Hyperlink"/>
@@ -17805,7 +17770,7 @@
         </w:rPr>
         <w:t xml:space="preserve">8　</w:t>
       </w:r>
-      <w:hyperlink w:history="1" r:id="rIdjt330azw69ugndkvp7dja">
+      <w:hyperlink w:history="1" r:id="rIdom87xqlaiba3cdzuinbbb">
         <w:r>
           <w:rPr>
             <w:rStyle w:val="Hyperlink"/>
@@ -17831,7 +17796,7 @@
         </w:rPr>
         <w:t xml:space="preserve">9　</w:t>
       </w:r>
-      <w:hyperlink w:history="1" r:id="rIddy_jv-xr9xxgdwpffcfgw">
+      <w:hyperlink w:history="1" r:id="rIdjyg6gdx7z-jevvk3bka6i">
         <w:r>
           <w:rPr>
             <w:rStyle w:val="Hyperlink"/>
@@ -17857,7 +17822,7 @@
         </w:rPr>
         <w:t xml:space="preserve">10　</w:t>
       </w:r>
-      <w:hyperlink w:history="1" r:id="rIddfuozy6kwf__y1fquuarr">
+      <w:hyperlink w:history="1" r:id="rIdipyueb8bfgvy2hitm6lby">
         <w:r>
           <w:rPr>
             <w:rStyle w:val="Hyperlink"/>
@@ -17883,7 +17848,7 @@
         </w:rPr>
         <w:t xml:space="preserve">11　</w:t>
       </w:r>
-      <w:hyperlink w:history="1" r:id="rIdr3vcxhc9mbloqwsw1onve">
+      <w:hyperlink w:history="1" r:id="rIdlr0jrjjfnyd0fcey5as6n">
         <w:r>
           <w:rPr>
             <w:rStyle w:val="Hyperlink"/>
@@ -17909,7 +17874,7 @@
         </w:rPr>
         <w:t xml:space="preserve">12　</w:t>
       </w:r>
-      <w:hyperlink w:history="1" r:id="rIdj-wrpmgvordk0r49nmggm">
+      <w:hyperlink w:history="1" r:id="rIdpspgxdomu264qahmgopbx">
         <w:r>
           <w:rPr>
             <w:rStyle w:val="Hyperlink"/>
@@ -17935,7 +17900,7 @@
         </w:rPr>
         <w:t xml:space="preserve">13　</w:t>
       </w:r>
-      <w:hyperlink w:history="1" r:id="rIdum154da1byebgkytszyiu">
+      <w:hyperlink w:history="1" r:id="rIdcq4yq-v3_ytacf2g4t54c">
         <w:r>
           <w:rPr>
             <w:rStyle w:val="Hyperlink"/>
@@ -17961,7 +17926,7 @@
         </w:rPr>
         <w:t xml:space="preserve">14　</w:t>
       </w:r>
-      <w:hyperlink w:history="1" r:id="rIdvh0jia_kqchc8i-2u5s55">
+      <w:hyperlink w:history="1" r:id="rIdkfshrm0wq_s0jrg92ouyx">
         <w:r>
           <w:rPr>
             <w:rStyle w:val="Hyperlink"/>
@@ -17987,7 +17952,7 @@
         </w:rPr>
         <w:t xml:space="preserve">15　</w:t>
       </w:r>
-      <w:hyperlink w:history="1" r:id="rIdy8if2b88dak-n1ft6_ypg">
+      <w:hyperlink w:history="1" r:id="rIdx3jsnr1gvlk1-7dxkvix8">
         <w:r>
           <w:rPr>
             <w:rStyle w:val="Hyperlink"/>
@@ -18013,7 +17978,7 @@
         </w:rPr>
         <w:t xml:space="preserve">16　</w:t>
       </w:r>
-      <w:hyperlink w:history="1" r:id="rIdcciadsoq235nic-hx6h7y">
+      <w:hyperlink w:history="1" r:id="rIdoza1qpuoylbkkp8u_x5ia">
         <w:r>
           <w:rPr>
             <w:rStyle w:val="Hyperlink"/>
@@ -18039,7 +18004,7 @@
         </w:rPr>
         <w:t xml:space="preserve">17　</w:t>
       </w:r>
-      <w:hyperlink w:history="1" r:id="rIdqgrvfuhtcnwrhd4r0vv4f">
+      <w:hyperlink w:history="1" r:id="rIdr0g2ydbmlqnzeynhedzhp">
         <w:r>
           <w:rPr>
             <w:rStyle w:val="Hyperlink"/>
@@ -18065,7 +18030,7 @@
         </w:rPr>
         <w:t xml:space="preserve">18　</w:t>
       </w:r>
-      <w:hyperlink w:history="1" r:id="rIdduwfnyv9hthrojrgdw4co">
+      <w:hyperlink w:history="1" r:id="rIdtsfynekiqf1ccbhq2-4wk">
         <w:r>
           <w:rPr>
             <w:rStyle w:val="Hyperlink"/>
@@ -18091,7 +18056,7 @@
         </w:rPr>
         <w:t xml:space="preserve">19　</w:t>
       </w:r>
-      <w:hyperlink w:history="1" r:id="rId6xxbbpmdaftak24mwsvoa">
+      <w:hyperlink w:history="1" r:id="rId9omdai3lmx7tfx2mxiv9t">
         <w:r>
           <w:rPr>
             <w:rStyle w:val="Hyperlink"/>
@@ -18117,7 +18082,7 @@
         </w:rPr>
         <w:t xml:space="preserve">20　</w:t>
       </w:r>
-      <w:hyperlink w:history="1" r:id="rId_xsyexw0c5iby235rw30o">
+      <w:hyperlink w:history="1" r:id="rIdqbule_fikexlb7ubpgrpg">
         <w:r>
           <w:rPr>
             <w:rStyle w:val="Hyperlink"/>
@@ -18143,7 +18108,7 @@
         </w:rPr>
         <w:t xml:space="preserve">21　</w:t>
       </w:r>
-      <w:hyperlink w:history="1" r:id="rId60t4c5lyghmd7xgexbsyx">
+      <w:hyperlink w:history="1" r:id="rIdiuuduc6ozblg1hwxely13">
         <w:r>
           <w:rPr>
             <w:rStyle w:val="Hyperlink"/>
@@ -18169,7 +18134,7 @@
         </w:rPr>
         <w:t xml:space="preserve">22　</w:t>
       </w:r>
-      <w:hyperlink w:history="1" r:id="rIdu_pe5rsxvltgwlpxanayy">
+      <w:hyperlink w:history="1" r:id="rIdnurjflczlfojpxdty11vf">
         <w:r>
           <w:rPr>
             <w:rStyle w:val="Hyperlink"/>
@@ -18195,7 +18160,7 @@
         </w:rPr>
         <w:t xml:space="preserve">23　</w:t>
       </w:r>
-      <w:hyperlink w:history="1" r:id="rIdh5k5hnt7y7cqkk5hgllgd">
+      <w:hyperlink w:history="1" r:id="rIdwbmfc05akwx4ww5de4bvx">
         <w:r>
           <w:rPr>
             <w:rStyle w:val="Hyperlink"/>
@@ -18221,7 +18186,7 @@
           <w:sz w:val="28"/>
           <w:szCs w:val="28"/>
         </w:rPr>
-        <w:t xml:space="preserve">19. </w:t>
+        <w:t xml:space="preserve">19. 家校溝通與資料披露</w:t>
       </w:r>
     </w:p>
     <w:p>
@@ -18720,7 +18685,7 @@
         </w:rPr>
         <w:t xml:space="preserve">1　</w:t>
       </w:r>
-      <w:hyperlink w:history="1" r:id="rIdv8lmjj3j9pc2g5_gggslv">
+      <w:hyperlink w:history="1" r:id="rIdf8lksbshcl4lh5-xxuemr">
         <w:r>
           <w:rPr>
             <w:rStyle w:val="Hyperlink"/>
@@ -18746,7 +18711,7 @@
         </w:rPr>
         <w:t xml:space="preserve">2　</w:t>
       </w:r>
-      <w:hyperlink w:history="1" r:id="rIdflptmhwmgl9lgceybbujf">
+      <w:hyperlink w:history="1" r:id="rIdsx5ncb3tkbffflzh6cogf">
         <w:r>
           <w:rPr>
             <w:rStyle w:val="Hyperlink"/>
@@ -18772,7 +18737,7 @@
         </w:rPr>
         <w:t xml:space="preserve">3　</w:t>
       </w:r>
-      <w:hyperlink w:history="1" r:id="rId4yuwybusgtjm02fxv5p2f">
+      <w:hyperlink w:history="1" r:id="rIds9hwudcqi4hearyoplep7">
         <w:r>
           <w:rPr>
             <w:rStyle w:val="Hyperlink"/>
@@ -18798,7 +18763,7 @@
         </w:rPr>
         <w:t xml:space="preserve">4　</w:t>
       </w:r>
-      <w:hyperlink w:history="1" r:id="rIdvxwrdeou7m51biesc1u55">
+      <w:hyperlink w:history="1" r:id="rId1mhwztxrecygqw7yg_wv1">
         <w:r>
           <w:rPr>
             <w:rStyle w:val="Hyperlink"/>
@@ -18824,7 +18789,7 @@
         </w:rPr>
         <w:t xml:space="preserve">5　</w:t>
       </w:r>
-      <w:hyperlink w:history="1" r:id="rIduttnrmgvwkt1zzxfxgca9">
+      <w:hyperlink w:history="1" r:id="rId9bvzouhv3hrazdjd6ck0f">
         <w:r>
           <w:rPr>
             <w:rStyle w:val="Hyperlink"/>
@@ -18850,7 +18815,7 @@
         </w:rPr>
         <w:t xml:space="preserve">6　</w:t>
       </w:r>
-      <w:hyperlink w:history="1" r:id="rIdgey7kqo5ke58tzyptdoam">
+      <w:hyperlink w:history="1" r:id="rId27emj5kvtevqybaclc9en">
         <w:r>
           <w:rPr>
             <w:rStyle w:val="Hyperlink"/>
@@ -18876,7 +18841,7 @@
         </w:rPr>
         <w:t xml:space="preserve">7　</w:t>
       </w:r>
-      <w:hyperlink w:history="1" r:id="rIdv3regmrgjifzgwexqkada">
+      <w:hyperlink w:history="1" r:id="rIdyph91nrwpgyz3rqikb9pi">
         <w:r>
           <w:rPr>
             <w:rStyle w:val="Hyperlink"/>
@@ -18902,7 +18867,7 @@
         </w:rPr>
         <w:t xml:space="preserve">8, 12　</w:t>
       </w:r>
-      <w:hyperlink w:history="1" r:id="rId7zikfr6if_lrniaacs4jo">
+      <w:hyperlink w:history="1" r:id="rIdligpbk7jq0ffvldp1c6rq">
         <w:r>
           <w:rPr>
             <w:rStyle w:val="Hyperlink"/>
@@ -18928,7 +18893,7 @@
         </w:rPr>
         <w:t xml:space="preserve">9　</w:t>
       </w:r>
-      <w:hyperlink w:history="1" r:id="rId5saisfwuxv8wwtprh7xks">
+      <w:hyperlink w:history="1" r:id="rIdp0bo55so191dzvs94bfon">
         <w:r>
           <w:rPr>
             <w:rStyle w:val="Hyperlink"/>
@@ -18954,7 +18919,7 @@
         </w:rPr>
         <w:t xml:space="preserve">10　</w:t>
       </w:r>
-      <w:hyperlink w:history="1" r:id="rIdpfqleb5dzmuqfxlfv0sfu">
+      <w:hyperlink w:history="1" r:id="rId9vjpuwsfhjeflpvpl8jet">
         <w:r>
           <w:rPr>
             <w:rStyle w:val="Hyperlink"/>
@@ -18980,7 +18945,7 @@
         </w:rPr>
         <w:t xml:space="preserve">11　</w:t>
       </w:r>
-      <w:hyperlink w:history="1" r:id="rIdmlhuzwm95e4osc7j4m1ou">
+      <w:hyperlink w:history="1" r:id="rIdzbw5vlnlwryznt_fa7vqt">
         <w:r>
           <w:rPr>
             <w:rStyle w:val="Hyperlink"/>
@@ -19006,7 +18971,7 @@
         </w:rPr>
         <w:t xml:space="preserve">13　</w:t>
       </w:r>
-      <w:hyperlink w:history="1" r:id="rIdc7tmptghheywtneelx1es">
+      <w:hyperlink w:history="1" r:id="rIdsslf94v_bbkdpfpyqhsgd">
         <w:r>
           <w:rPr>
             <w:rStyle w:val="Hyperlink"/>
@@ -19032,7 +18997,7 @@
         </w:rPr>
         <w:t xml:space="preserve">14　</w:t>
       </w:r>
-      <w:hyperlink w:history="1" r:id="rId4aknf7t7bs61a2ja5wqa2">
+      <w:hyperlink w:history="1" r:id="rIdnvzqmmkbjm-f4kyeg0wu4">
         <w:r>
           <w:rPr>
             <w:rStyle w:val="Hyperlink"/>
@@ -19058,7 +19023,7 @@
         </w:rPr>
         <w:t xml:space="preserve">15　</w:t>
       </w:r>
-      <w:hyperlink w:history="1" r:id="rIduprptz6wojovcj-lalj32">
+      <w:hyperlink w:history="1" r:id="rIdgmgdwr3i4ctfh3ieirzc-">
         <w:r>
           <w:rPr>
             <w:rStyle w:val="Hyperlink"/>
@@ -19084,7 +19049,7 @@
           <w:sz w:val="28"/>
           <w:szCs w:val="28"/>
         </w:rPr>
-        <w:t xml:space="preserve">20. </w:t>
+        <w:t xml:space="preserve">20. 紀錄保存、查閱與一般行政</w:t>
       </w:r>
     </w:p>
     <w:p>
@@ -19648,7 +19613,7 @@
         </w:rPr>
         <w:t xml:space="preserve">1　</w:t>
       </w:r>
-      <w:hyperlink w:history="1" r:id="rIdtmzf5mmcexy9rdk65o1dt">
+      <w:hyperlink w:history="1" r:id="rIdkcnan4s-ljfhckapwlyps">
         <w:r>
           <w:rPr>
             <w:rStyle w:val="Hyperlink"/>
@@ -19674,7 +19639,7 @@
         </w:rPr>
         <w:t xml:space="preserve">2　</w:t>
       </w:r>
-      <w:hyperlink w:history="1" r:id="rIdli8-evx2t3dosjmepcctt">
+      <w:hyperlink w:history="1" r:id="rIdpbegka85j1erhgzy34fks">
         <w:r>
           <w:rPr>
             <w:rStyle w:val="Hyperlink"/>
@@ -19700,7 +19665,7 @@
         </w:rPr>
         <w:t xml:space="preserve">3　</w:t>
       </w:r>
-      <w:hyperlink w:history="1" r:id="rIdv_ueptzdpyjwcp0yhq2f1">
+      <w:hyperlink w:history="1" r:id="rIdf034bxsg2e--khd4t6lv0">
         <w:r>
           <w:rPr>
             <w:rStyle w:val="Hyperlink"/>
@@ -19726,7 +19691,7 @@
         </w:rPr>
         <w:t xml:space="preserve">4　</w:t>
       </w:r>
-      <w:hyperlink w:history="1" r:id="rIdgcv_vjpneahvciql1dmpo">
+      <w:hyperlink w:history="1" r:id="rIdwu9epmd7l2t4gkhu_t77o">
         <w:r>
           <w:rPr>
             <w:rStyle w:val="Hyperlink"/>
@@ -19752,7 +19717,7 @@
         </w:rPr>
         <w:t xml:space="preserve">5, 8　</w:t>
       </w:r>
-      <w:hyperlink w:history="1" r:id="rIdljh-qck7fh6jxjqft9p4n">
+      <w:hyperlink w:history="1" r:id="rIdj04ctidiorhduur3msuas">
         <w:r>
           <w:rPr>
             <w:rStyle w:val="Hyperlink"/>
@@ -19778,7 +19743,7 @@
         </w:rPr>
         <w:t xml:space="preserve">6　</w:t>
       </w:r>
-      <w:hyperlink w:history="1" r:id="rIdq1zp1spqufotfdbnfkgjs">
+      <w:hyperlink w:history="1" r:id="rId5go5vw5ddlvqcrmgo_egm">
         <w:r>
           <w:rPr>
             <w:rStyle w:val="Hyperlink"/>
@@ -19804,7 +19769,7 @@
         </w:rPr>
         <w:t xml:space="preserve">7　</w:t>
       </w:r>
-      <w:hyperlink w:history="1" r:id="rIdwuj8fdujhnvlo8ncabjgq">
+      <w:hyperlink w:history="1" r:id="rIdnmktpgdln5_fkdtjd6lzh">
         <w:r>
           <w:rPr>
             <w:rStyle w:val="Hyperlink"/>
@@ -19830,7 +19795,7 @@
         </w:rPr>
         <w:t xml:space="preserve">9　</w:t>
       </w:r>
-      <w:hyperlink w:history="1" r:id="rIdib2sazrnpd6lmk3cr5zrd">
+      <w:hyperlink w:history="1" r:id="rIdb45fsy2azdbzihganqqp1">
         <w:r>
           <w:rPr>
             <w:rStyle w:val="Hyperlink"/>
@@ -19856,7 +19821,7 @@
         </w:rPr>
         <w:t xml:space="preserve">10　</w:t>
       </w:r>
-      <w:hyperlink w:history="1" r:id="rId0tulqlpsvw-dg-cagsa55">
+      <w:hyperlink w:history="1" r:id="rId03dfjdk6n9obnvgolwy5g">
         <w:r>
           <w:rPr>
             <w:rStyle w:val="Hyperlink"/>
@@ -19882,7 +19847,7 @@
         </w:rPr>
         <w:t xml:space="preserve">11　</w:t>
       </w:r>
-      <w:hyperlink w:history="1" r:id="rIdqankxkc2curixchbo2nvb">
+      <w:hyperlink w:history="1" r:id="rId3tatzeuhle_wflgx3-xby">
         <w:r>
           <w:rPr>
             <w:rStyle w:val="Hyperlink"/>

</xml_diff>